<commit_message>
Typo fixes and rewrites
</commit_message>
<xml_diff>
--- a/template/review_template.docx
+++ b/template/review_template.docx
@@ -60,7 +60,7 @@
           <w:bCs/>
           <w:lang w:val="fr-FR"/>
         </w:rPr>
-        <w:t>Repository informations</w:t>
+        <w:t>Repository information</w:t>
       </w:r>
     </w:p>
     <w:p>
@@ -334,23 +334,7 @@
           <w:u w:val="none"/>
           <w:lang w:val="fr-FR"/>
         </w:rPr>
-        <w:t>A - Initial stat</w:t>
-      </w:r>
-      <w:r>
-        <w:rPr>
-          <w:rFonts w:cs="Arial"/>
-          <w:u w:val="none"/>
-          <w:lang w:val="fr-FR"/>
-        </w:rPr>
-        <w:t>us</w:t>
-      </w:r>
-      <w:r>
-        <w:rPr>
-          <w:rFonts w:cs="Arial"/>
-          <w:u w:val="none"/>
-          <w:lang w:val="fr-FR"/>
-        </w:rPr>
-        <w:t xml:space="preserve"> before review</w:t>
+        <w:t>A - Initial status before review</w:t>
       </w:r>
     </w:p>
     <w:p>
@@ -384,7 +368,25 @@
           <w:bCs/>
           <w:lang w:val="fr-FR"/>
         </w:rPr>
-        <w:t>All issue’s informations</w:t>
+        <w:t xml:space="preserve">All </w:t>
+      </w:r>
+      <w:r>
+        <w:rPr>
+          <w:rFonts w:cs="Arial"/>
+          <w:b/>
+          <w:bCs/>
+          <w:lang w:val="fr-FR"/>
+        </w:rPr>
+        <w:t xml:space="preserve">the </w:t>
+      </w:r>
+      <w:r>
+        <w:rPr>
+          <w:rFonts w:cs="Arial"/>
+          <w:b/>
+          <w:bCs/>
+          <w:lang w:val="fr-FR"/>
+        </w:rPr>
+        <w:t>issue’s informations</w:t>
       </w:r>
       <w:r>
         <w:rPr>
@@ -393,7 +395,25 @@
           <w:bCs w:val="false"/>
           <w:lang w:val="fr-FR"/>
         </w:rPr>
-        <w:t xml:space="preserve"> was exact:</w:t>
+        <w:t xml:space="preserve"> </w:t>
+      </w:r>
+      <w:r>
+        <w:rPr>
+          <w:rFonts w:cs="Arial"/>
+          <w:b w:val="false"/>
+          <w:bCs w:val="false"/>
+          <w:lang w:val="fr-FR"/>
+        </w:rPr>
+        <w:t>were</w:t>
+      </w:r>
+      <w:r>
+        <w:rPr>
+          <w:rFonts w:cs="Arial"/>
+          <w:b w:val="false"/>
+          <w:bCs w:val="false"/>
+          <w:lang w:val="fr-FR"/>
+        </w:rPr>
+        <w:t xml:space="preserve"> exact:</w:t>
       </w:r>
     </w:p>
     <w:p>
@@ -541,7 +561,35 @@
           <w:rFonts w:cs="Arial"/>
           <w:lang w:val="fr-FR"/>
         </w:rPr>
-        <w:t xml:space="preserve"> at the beginning:</w:t>
+        <w:t xml:space="preserve"> </w:t>
+      </w:r>
+      <w:r>
+        <w:rPr>
+          <w:rFonts w:cs="Arial"/>
+          <w:lang w:val="fr-FR"/>
+        </w:rPr>
+        <w:t xml:space="preserve">from </w:t>
+      </w:r>
+      <w:r>
+        <w:rPr>
+          <w:rFonts w:cs="Arial"/>
+          <w:lang w:val="fr-FR"/>
+        </w:rPr>
+        <w:t xml:space="preserve">the </w:t>
+      </w:r>
+      <w:r>
+        <w:rPr>
+          <w:rFonts w:cs="Arial"/>
+          <w:lang w:val="en-US" w:eastAsia="zh-CN" w:bidi="hi-IN"/>
+        </w:rPr>
+        <w:t>beginning</w:t>
+      </w:r>
+      <w:r>
+        <w:rPr>
+          <w:rFonts w:cs="Arial"/>
+          <w:lang w:val="fr-FR"/>
+        </w:rPr>
+        <w:t>:</w:t>
       </w:r>
     </w:p>
     <w:p>
@@ -836,7 +884,21 @@
           <w:rFonts w:cs="Arial"/>
           <w:lang w:val="fr-FR"/>
         </w:rPr>
-        <w:t xml:space="preserve"> needed to reproduce the results were available:</w:t>
+        <w:t xml:space="preserve"> needed to reproduce the results </w:t>
+      </w:r>
+      <w:r>
+        <w:rPr>
+          <w:rFonts w:cs="Arial"/>
+          <w:lang w:val="fr-FR"/>
+        </w:rPr>
+        <w:t>was</w:t>
+      </w:r>
+      <w:r>
+        <w:rPr>
+          <w:rFonts w:cs="Arial"/>
+          <w:lang w:val="fr-FR"/>
+        </w:rPr>
+        <w:t xml:space="preserve"> available:</w:t>
       </w:r>
     </w:p>
     <w:p>
@@ -885,7 +947,14 @@
           <w:rFonts w:cs="Arial" w:ascii="Arial" w:hAnsi="Arial"/>
           <w:lang w:val="fr-FR"/>
         </w:rPr>
-        <w:t>Yes, all</w:t>
+        <w:t xml:space="preserve">Yes, all </w:t>
+      </w:r>
+      <w:r>
+        <w:rPr>
+          <w:rFonts w:cs="Arial" w:ascii="Arial" w:hAnsi="Arial"/>
+          <w:lang w:val="fr-FR"/>
+        </w:rPr>
+        <w:t>of it</w:t>
       </w:r>
     </w:p>
     <w:p>
@@ -934,7 +1003,14 @@
           <w:rFonts w:cs="Arial" w:ascii="Arial" w:hAnsi="Arial"/>
           <w:lang w:val="fr-FR"/>
         </w:rPr>
-        <w:t>Yes, for the most part</w:t>
+        <w:t xml:space="preserve">Yes, </w:t>
+      </w:r>
+      <w:r>
+        <w:rPr>
+          <w:rFonts w:cs="Arial" w:ascii="Arial" w:hAnsi="Arial"/>
+          <w:lang w:val="fr-FR"/>
+        </w:rPr>
+        <w:t>most of it</w:t>
       </w:r>
     </w:p>
     <w:p>
@@ -1261,7 +1337,17 @@
           <w:highlight w:val="lightGray"/>
           <w:lang w:val="fr-FR"/>
         </w:rPr>
-        <w:t>Describe here all the steps taken to reproduce the results: the commands used to install dependencies, to compile and run the program, etc.</w:t>
+        <w:t>Please d</w:t>
+      </w:r>
+      <w:r>
+        <w:rPr>
+          <w:rFonts w:cs="Arial" w:ascii="Arial" w:hAnsi="Arial"/>
+          <w:i/>
+          <w:iCs/>
+          <w:highlight w:val="lightGray"/>
+          <w:lang w:val="fr-FR"/>
+        </w:rPr>
+        <w:t>escribe here all the steps taken to reproduce the results: the commands used to install dependencies, to compile and run the program, etc.</w:t>
       </w:r>
     </w:p>
     <w:p>
@@ -1309,7 +1395,23 @@
           <w:u w:val="none"/>
           <w:lang w:val="fr-FR"/>
         </w:rPr>
-        <w:t>C - Outcome</w:t>
+        <w:t>C – Outcome</w:t>
+      </w:r>
+      <w:r>
+        <w:rPr>
+          <w:rFonts w:cs="Arial"/>
+          <w:u w:val="none"/>
+          <w:lang w:val="fr-FR"/>
+        </w:rPr>
+        <w:t xml:space="preserve"> </w:t>
+      </w:r>
+      <w:r>
+        <w:rPr>
+          <w:rFonts w:cs="Arial"/>
+          <w:u w:val="none"/>
+          <w:lang w:val="fr-FR"/>
+        </w:rPr>
+        <w:t>after the review</w:t>
       </w:r>
     </w:p>
     <w:p>
@@ -2226,7 +2328,21 @@
           <w:rFonts w:cs="Arial"/>
           <w:lang w:val="fr-FR"/>
         </w:rPr>
-        <w:t>2 - Reproductibility</w:t>
+        <w:t>2 - Reprodu</w:t>
+      </w:r>
+      <w:r>
+        <w:rPr>
+          <w:rFonts w:cs="Arial"/>
+          <w:lang w:val="fr-FR"/>
+        </w:rPr>
+        <w:t>cibi</w:t>
+      </w:r>
+      <w:r>
+        <w:rPr>
+          <w:rFonts w:cs="Arial"/>
+          <w:lang w:val="fr-FR"/>
+        </w:rPr>
+        <w:t>lity</w:t>
       </w:r>
     </w:p>
     <w:p>
@@ -2259,9 +2375,18 @@
       <w:r>
         <w:rPr>
           <w:rFonts w:cs="Arial"/>
-          <w:lang w:val="fr-FR"/>
-        </w:rPr>
-        <w:t xml:space="preserve"> :</w:t>
+          <w:b/>
+          <w:bCs/>
+          <w:lang w:val="fr-FR"/>
+        </w:rPr>
+        <w:t>s</w:t>
+      </w:r>
+      <w:r>
+        <w:rPr>
+          <w:rFonts w:cs="Arial"/>
+          <w:lang w:val="fr-FR"/>
+        </w:rPr>
+        <w:t>:</w:t>
       </w:r>
     </w:p>
     <w:p>
@@ -2310,14 +2435,7 @@
           <w:rFonts w:cs="Arial" w:ascii="Arial" w:hAnsi="Arial"/>
           <w:lang w:val="fr-FR"/>
         </w:rPr>
-        <w:t>w</w:t>
-      </w:r>
-      <w:r>
-        <w:rPr>
-          <w:rFonts w:cs="Arial" w:ascii="Arial" w:hAnsi="Arial"/>
-          <w:lang w:val="fr-FR"/>
-        </w:rPr>
-        <w:t>ithout error</w:t>
+        <w:t>without error</w:t>
       </w:r>
     </w:p>
     <w:p>
@@ -2366,19 +2484,13 @@
           <w:rFonts w:cs="Arial" w:ascii="Arial" w:hAnsi="Arial"/>
           <w:lang w:val="fr-FR"/>
         </w:rPr>
-        <w:t>w</w:t>
-      </w:r>
-      <w:r>
-        <w:rPr>
-          <w:rFonts w:cs="Arial" w:ascii="Arial" w:hAnsi="Arial"/>
-          <w:lang w:val="fr-FR"/>
-        </w:rPr>
-        <w:t>ith errors</w:t>
-      </w:r>
-    </w:p>
-    <w:p>
-      <w:pPr>
-        <w:pStyle w:val="Normal"/>
+        <w:t>with errors</w:t>
+      </w:r>
+    </w:p>
+    <w:p>
+      <w:pPr>
+        <w:pStyle w:val="Normal"/>
+        <w:bidi w:val="0"/>
         <w:ind w:firstLine="414" w:start="720" w:end="0"/>
         <w:rPr>
           <w:rFonts w:ascii="Arial" w:hAnsi="Arial" w:cs="Arial"/>
@@ -2467,7 +2579,7 @@
           <w:bCs/>
           <w:lang w:val="fr-FR"/>
         </w:rPr>
-        <w:t>is running</w:t>
+        <w:t>runs</w:t>
       </w:r>
       <w:r>
         <w:rPr>
@@ -2525,14 +2637,7 @@
           <w:rFonts w:cs="Arial" w:ascii="Arial" w:hAnsi="Arial"/>
           <w:lang w:val="fr-FR"/>
         </w:rPr>
-        <w:t>w</w:t>
-      </w:r>
-      <w:r>
-        <w:rPr>
-          <w:rFonts w:cs="Arial" w:ascii="Arial" w:hAnsi="Arial"/>
-          <w:lang w:val="fr-FR"/>
-        </w:rPr>
-        <w:t>ithout error</w:t>
+        <w:t>without error</w:t>
       </w:r>
     </w:p>
     <w:p>
@@ -2582,14 +2687,7 @@
           <w:rFonts w:cs="Arial" w:ascii="Arial" w:hAnsi="Arial"/>
           <w:lang w:val="fr-FR"/>
         </w:rPr>
-        <w:t>w</w:t>
-      </w:r>
-      <w:r>
-        <w:rPr>
-          <w:rFonts w:cs="Arial" w:ascii="Arial" w:hAnsi="Arial"/>
-          <w:lang w:val="fr-FR"/>
-        </w:rPr>
-        <w:t>ith errors</w:t>
+        <w:t>with errors</w:t>
       </w:r>
     </w:p>
     <w:p>
@@ -2621,11 +2719,29 @@
       <w:r>
         <w:rPr>
           <w:rFonts w:cs="Arial"/>
+          <w:b w:val="false"/>
+          <w:bCs w:val="false"/>
+          <w:lang w:val="fr-FR"/>
+        </w:rPr>
+        <w:t xml:space="preserve">Measured </w:t>
+      </w:r>
+      <w:r>
+        <w:rPr>
+          <w:rFonts w:cs="Arial"/>
           <w:b/>
           <w:bCs/>
           <w:lang w:val="fr-FR"/>
         </w:rPr>
-        <w:t>Execution time</w:t>
+        <w:t>e</w:t>
+      </w:r>
+      <w:r>
+        <w:rPr>
+          <w:rFonts w:cs="Arial"/>
+          <w:b/>
+          <w:bCs/>
+          <w:lang w:val="fr-FR"/>
+        </w:rPr>
+        <w:t>xecution time</w:t>
       </w:r>
       <w:r>
         <w:rPr>
@@ -2634,7 +2750,7 @@
           <w:bCs w:val="false"/>
           <w:lang w:val="fr-FR"/>
         </w:rPr>
-        <w:t xml:space="preserve"> measured: </w:t>
+        <w:t xml:space="preserve">: </w:t>
       </w:r>
     </w:p>
     <w:p>
@@ -2683,7 +2799,14 @@
           <w:rFonts w:cs="Arial"/>
           <w:lang w:val="fr-FR"/>
         </w:rPr>
-        <w:t>, it's done:</w:t>
+        <w:t xml:space="preserve">, it </w:t>
+      </w:r>
+      <w:r>
+        <w:rPr>
+          <w:rFonts w:cs="Arial"/>
+          <w:lang w:val="fr-FR"/>
+        </w:rPr>
+        <w:t>does...</w:t>
       </w:r>
     </w:p>
     <w:p>
@@ -2732,14 +2855,7 @@
           <w:rFonts w:cs="Arial" w:ascii="Arial" w:hAnsi="Arial"/>
           <w:lang w:val="fr-FR"/>
         </w:rPr>
-        <w:t>w</w:t>
-      </w:r>
-      <w:r>
-        <w:rPr>
-          <w:rFonts w:cs="Arial" w:ascii="Arial" w:hAnsi="Arial"/>
-          <w:lang w:val="fr-FR"/>
-        </w:rPr>
-        <w:t>ithout any changes to the code originally submitted</w:t>
+        <w:t>without any changes to the code originally submitted</w:t>
       </w:r>
     </w:p>
     <w:p>
@@ -2788,14 +2904,7 @@
           <w:rFonts w:cs="Arial" w:ascii="Arial" w:hAnsi="Arial"/>
           <w:lang w:val="fr-FR"/>
         </w:rPr>
-        <w:t>w</w:t>
-      </w:r>
-      <w:r>
-        <w:rPr>
-          <w:rFonts w:cs="Arial" w:ascii="Arial" w:hAnsi="Arial"/>
-          <w:lang w:val="fr-FR"/>
-        </w:rPr>
-        <w:t>ith a few minor changes to the code that was originally submitted</w:t>
+        <w:t>with a few minor changes to the code that was originally submitted</w:t>
       </w:r>
     </w:p>
     <w:p>
@@ -2845,14 +2954,7 @@
           <w:rFonts w:cs="Arial" w:ascii="Arial" w:hAnsi="Arial"/>
           <w:lang w:val="fr-FR"/>
         </w:rPr>
-        <w:t>w</w:t>
-      </w:r>
-      <w:r>
-        <w:rPr>
-          <w:rFonts w:cs="Arial" w:ascii="Arial" w:hAnsi="Arial"/>
-          <w:lang w:val="fr-FR"/>
-        </w:rPr>
-        <w:t>ith significant changes to the code that was originally submitted</w:t>
+        <w:t>with significant changes to the code that was originally submitted</w:t>
       </w:r>
     </w:p>
     <w:p>
@@ -2883,18 +2985,20 @@
       <w:r>
         <w:rPr>
           <w:rFonts w:cs="Arial"/>
-          <w:lang w:val="fr-FR"/>
-        </w:rPr>
-        <w:t xml:space="preserve">The </w:t>
-      </w:r>
-      <w:r>
-        <w:rPr>
-          <w:rFonts w:cs="Arial"/>
           <w:b/>
           <w:bCs/>
           <w:lang w:val="fr-FR"/>
         </w:rPr>
-        <w:t>results</w:t>
+        <w:t>R</w:t>
+      </w:r>
+      <w:r>
+        <w:rPr>
+          <w:rFonts w:cs="Arial"/>
+          <w:b/>
+          <w:bCs/>
+          <w:lang w:val="fr-FR"/>
+        </w:rPr>
+        <w:t>esults</w:t>
       </w:r>
       <w:r>
         <w:rPr>
@@ -2950,14 +3054,7 @@
           <w:rFonts w:cs="Arial" w:ascii="Arial" w:hAnsi="Arial"/>
           <w:lang w:val="fr-FR"/>
         </w:rPr>
-        <w:t>a</w:t>
-      </w:r>
-      <w:r>
-        <w:rPr>
-          <w:rFonts w:cs="Arial" w:ascii="Arial" w:hAnsi="Arial"/>
-          <w:lang w:val="fr-FR"/>
-        </w:rPr>
-        <w:t>lways</w:t>
+        <w:t>always</w:t>
       </w:r>
     </w:p>
     <w:p>
@@ -3006,14 +3103,7 @@
           <w:rFonts w:cs="Arial" w:ascii="Arial" w:hAnsi="Arial"/>
           <w:lang w:val="fr-FR"/>
         </w:rPr>
-        <w:t>s</w:t>
-      </w:r>
-      <w:r>
-        <w:rPr>
-          <w:rFonts w:cs="Arial" w:ascii="Arial" w:hAnsi="Arial"/>
-          <w:lang w:val="fr-FR"/>
-        </w:rPr>
-        <w:t>ometimes</w:t>
+        <w:t>sometimes</w:t>
       </w:r>
     </w:p>
     <w:p>
@@ -3063,14 +3153,7 @@
           <w:rFonts w:cs="Arial" w:ascii="Arial" w:hAnsi="Arial"/>
           <w:lang w:val="fr-FR"/>
         </w:rPr>
-        <w:t>n</w:t>
-      </w:r>
-      <w:r>
-        <w:rPr>
-          <w:rFonts w:cs="Arial" w:ascii="Arial" w:hAnsi="Arial"/>
-          <w:lang w:val="fr-FR"/>
-        </w:rPr>
-        <w:t>ever</w:t>
+        <w:t>never</w:t>
       </w:r>
     </w:p>
     <w:p>
@@ -3122,14 +3205,21 @@
           <w:b/>
           <w:bCs/>
         </w:rPr>
-        <w:t xml:space="preserve">consistent </w:t>
+        <w:t xml:space="preserve">consistent along </w:t>
       </w:r>
       <w:r>
         <w:rPr>
           <w:b/>
           <w:bCs/>
         </w:rPr>
-        <w:t>along runs</w:t>
+        <w:t xml:space="preserve">different </w:t>
+      </w:r>
+      <w:r>
+        <w:rPr>
+          <w:b/>
+          <w:bCs/>
+        </w:rPr>
+        <w:t>runs</w:t>
       </w:r>
       <w:r>
         <w:rPr/>
@@ -3231,7 +3321,35 @@
           <w:rFonts w:cs="Arial" w:ascii="Arial" w:hAnsi="Arial"/>
           <w:lang w:val="fr-FR"/>
         </w:rPr>
-        <w:t>Yes, on some runs, but not on all of them</w:t>
+        <w:t xml:space="preserve">Yes, </w:t>
+      </w:r>
+      <w:r>
+        <w:rPr>
+          <w:rFonts w:cs="Arial" w:ascii="Arial" w:hAnsi="Arial"/>
+          <w:lang w:val="fr-FR"/>
+        </w:rPr>
+        <w:t>for</w:t>
+      </w:r>
+      <w:r>
+        <w:rPr>
+          <w:rFonts w:cs="Arial" w:ascii="Arial" w:hAnsi="Arial"/>
+          <w:lang w:val="fr-FR"/>
+        </w:rPr>
+        <w:t xml:space="preserve"> some runs, but not </w:t>
+      </w:r>
+      <w:r>
+        <w:rPr>
+          <w:rFonts w:cs="Arial" w:ascii="Arial" w:hAnsi="Arial"/>
+          <w:lang w:val="fr-FR"/>
+        </w:rPr>
+        <w:t xml:space="preserve">for </w:t>
+      </w:r>
+      <w:r>
+        <w:rPr>
+          <w:rFonts w:cs="Arial" w:ascii="Arial" w:hAnsi="Arial"/>
+          <w:lang w:val="fr-FR"/>
+        </w:rPr>
+        <w:t>all of them</w:t>
       </w:r>
     </w:p>
     <w:p>
@@ -3395,14 +3513,7 @@
           <w:rFonts w:cs="Arial" w:ascii="Arial" w:hAnsi="Arial"/>
           <w:lang w:val="fr-FR"/>
         </w:rPr>
-        <w:t>e</w:t>
-      </w:r>
-      <w:r>
-        <w:rPr>
-          <w:rFonts w:cs="Arial" w:ascii="Arial" w:hAnsi="Arial"/>
-          <w:lang w:val="fr-FR"/>
-        </w:rPr>
-        <w:t>xactly</w:t>
+        <w:t>exactly</w:t>
       </w:r>
     </w:p>
     <w:p>
@@ -3451,14 +3562,7 @@
           <w:rFonts w:cs="Arial" w:ascii="Arial" w:hAnsi="Arial"/>
           <w:lang w:val="fr-FR"/>
         </w:rPr>
-        <w:t>w</w:t>
-      </w:r>
-      <w:r>
-        <w:rPr>
-          <w:rFonts w:cs="Arial" w:ascii="Arial" w:hAnsi="Arial"/>
-          <w:lang w:val="fr-FR"/>
-        </w:rPr>
-        <w:t>ith a few negligible differences</w:t>
+        <w:t>with a few negligible differences</w:t>
       </w:r>
     </w:p>
     <w:p>
@@ -3507,14 +3611,7 @@
           <w:rFonts w:cs="Arial" w:ascii="Arial" w:hAnsi="Arial"/>
           <w:lang w:val="fr-FR"/>
         </w:rPr>
-        <w:t>w</w:t>
-      </w:r>
-      <w:r>
-        <w:rPr>
-          <w:rFonts w:cs="Arial" w:ascii="Arial" w:hAnsi="Arial"/>
-          <w:lang w:val="fr-FR"/>
-        </w:rPr>
-        <w:t>ith a few notable differences</w:t>
+        <w:t>with a few notable differences</w:t>
       </w:r>
     </w:p>
     <w:p>
@@ -3563,14 +3660,7 @@
           <w:rFonts w:cs="Arial" w:ascii="Arial" w:hAnsi="Arial"/>
           <w:lang w:val="fr-FR"/>
         </w:rPr>
-        <w:t>w</w:t>
-      </w:r>
-      <w:r>
-        <w:rPr>
-          <w:rFonts w:cs="Arial" w:ascii="Arial" w:hAnsi="Arial"/>
-          <w:lang w:val="fr-FR"/>
-        </w:rPr>
-        <w:t>ith many differences</w:t>
+        <w:t>with many differences</w:t>
       </w:r>
     </w:p>
     <w:p>
@@ -3615,7 +3705,7 @@
           <w:u w:val="none"/>
           <w:lang w:val="fr-FR"/>
         </w:rPr>
-        <w:t>Résult</w:t>
+        <w:t>Decision</w:t>
       </w:r>
     </w:p>
     <w:p>
@@ -3773,7 +3863,28 @@
           <w:rFonts w:cs="Arial" w:ascii="Arial" w:hAnsi="Arial"/>
           <w:lang w:val="fr-FR"/>
         </w:rPr>
-        <w:t>Yes, with some reservations</w:t>
+        <w:t xml:space="preserve">Yes, </w:t>
+      </w:r>
+      <w:r>
+        <w:rPr>
+          <w:rFonts w:cs="Arial" w:ascii="Arial" w:hAnsi="Arial"/>
+          <w:lang w:val="fr-FR"/>
+        </w:rPr>
+        <w:t xml:space="preserve">although I have </w:t>
+      </w:r>
+      <w:r>
+        <w:rPr>
+          <w:rFonts w:cs="Arial" w:ascii="Arial" w:hAnsi="Arial"/>
+          <w:lang w:val="fr-FR"/>
+        </w:rPr>
+        <w:t xml:space="preserve">some </w:t>
+      </w:r>
+      <w:r>
+        <w:rPr>
+          <w:rFonts w:cs="Arial" w:ascii="Arial" w:hAnsi="Arial"/>
+          <w:lang w:val="fr-FR"/>
+        </w:rPr>
+        <w:t xml:space="preserve">minor concerns </w:t>
       </w:r>
     </w:p>
     <w:p>
@@ -3850,7 +3961,21 @@
           <w:rFonts w:cs="Arial" w:ascii="Arial" w:hAnsi="Arial"/>
           <w:lang w:val="fr-FR"/>
         </w:rPr>
-        <w:t xml:space="preserve">Any comments: </w:t>
+        <w:t>Any comments:</w:t>
+      </w:r>
+    </w:p>
+    <w:p>
+      <w:pPr>
+        <w:pStyle w:val="Normal"/>
+        <w:rPr>
+          <w:rFonts w:ascii="Arial" w:hAnsi="Arial" w:cs="Arial"/>
+        </w:rPr>
+      </w:pPr>
+      <w:r>
+        <w:rPr>
+          <w:rFonts w:cs="Arial" w:ascii="Arial" w:hAnsi="Arial"/>
+          <w:lang w:val="fr-FR"/>
+        </w:rPr>
       </w:r>
     </w:p>
     <w:sectPr>
@@ -5378,15 +5503,13 @@
   </w:style>
   <w:style w:type="character" w:styleId="FootnoteCharacters">
     <w:name w:val="Footnote Characters"/>
-    <w:uiPriority w:val="99"/>
-    <w:unhideWhenUsed/>
     <w:qFormat/>
     <w:rPr>
       <w:vertAlign w:val="superscript"/>
     </w:rPr>
   </w:style>
-  <w:style w:type="character" w:styleId="FootnoteCharactersuser">
-    <w:name w:val="Footnote Characters (user)"/>
+  <w:style w:type="character" w:styleId="Caracteresdenotaalpie">
+    <w:name w:val="Caracteres de nota al pie"/>
     <w:qFormat/>
     <w:rPr>
       <w:vertAlign w:val="superscript"/>
@@ -5408,16 +5531,13 @@
   </w:style>
   <w:style w:type="character" w:styleId="EndnoteCharacters">
     <w:name w:val="Endnote Characters"/>
-    <w:uiPriority w:val="99"/>
-    <w:semiHidden/>
-    <w:unhideWhenUsed/>
     <w:qFormat/>
     <w:rPr>
       <w:vertAlign w:val="superscript"/>
     </w:rPr>
   </w:style>
-  <w:style w:type="character" w:styleId="EndnoteCharactersuser">
-    <w:name w:val="Endnote Characters (user)"/>
+  <w:style w:type="character" w:styleId="Caracteresdenotafinal">
+    <w:name w:val="Caracteres de nota final"/>
     <w:qFormat/>
     <w:rPr>
       <w:vertAlign w:val="superscript"/>
@@ -5457,8 +5577,8 @@
       <w:szCs w:val="18"/>
     </w:rPr>
   </w:style>
-  <w:style w:type="paragraph" w:styleId="Heading">
-    <w:name w:val="Heading"/>
+  <w:style w:type="paragraph" w:styleId="Ttulo">
+    <w:name w:val="Título"/>
     <w:basedOn w:val="Normal"/>
     <w:next w:val="BodyText"/>
     <w:qFormat/>
@@ -5506,8 +5626,8 @@
       <w:szCs w:val="18"/>
     </w:rPr>
   </w:style>
-  <w:style w:type="paragraph" w:styleId="Index">
-    <w:name w:val="Index"/>
+  <w:style w:type="paragraph" w:styleId="ndice">
+    <w:name w:val="Índice"/>
     <w:basedOn w:val="Normal"/>
     <w:qFormat/>
     <w:pPr>
@@ -5742,7 +5862,7 @@
   </w:style>
   <w:style w:type="paragraph" w:styleId="IndexHeading">
     <w:name w:val="index heading"/>
-    <w:basedOn w:val="Heading"/>
+    <w:basedOn w:val="Ttulo"/>
     <w:pPr/>
     <w:rPr/>
   </w:style>
@@ -5777,8 +5897,8 @@
     </w:pPr>
     <w:rPr/>
   </w:style>
-  <w:style w:type="paragraph" w:styleId="HeaderandFooter">
-    <w:name w:val="Header and Footer"/>
+  <w:style w:type="paragraph" w:styleId="Cabeceraypie">
+    <w:name w:val="Cabecera y pie"/>
     <w:basedOn w:val="Normal"/>
     <w:qFormat/>
     <w:pPr/>
@@ -5822,8 +5942,8 @@
       <w:szCs w:val="18"/>
     </w:rPr>
   </w:style>
-  <w:style w:type="numbering" w:styleId="NoList" w:default="1">
-    <w:name w:val="No List"/>
+  <w:style w:type="numbering" w:styleId="Ningunalista" w:default="1">
+    <w:name w:val="Ninguna lista"/>
     <w:uiPriority w:val="99"/>
     <w:semiHidden/>
     <w:unhideWhenUsed/>
@@ -5840,37 +5960,37 @@
         <a:srgbClr val="000000"/>
       </a:dk1>
       <a:lt1>
-        <a:srgbClr val="ffffff"/>
+        <a:srgbClr val="FFFFFF"/>
       </a:lt1>
       <a:dk2>
-        <a:srgbClr val="44546a"/>
+        <a:srgbClr val="44546A"/>
       </a:dk2>
       <a:lt2>
-        <a:srgbClr val="e7e6e6"/>
+        <a:srgbClr val="E7E6E6"/>
       </a:lt2>
       <a:accent1>
-        <a:srgbClr val="5b9bd5"/>
+        <a:srgbClr val="5B9BD5"/>
       </a:accent1>
       <a:accent2>
-        <a:srgbClr val="ed7d31"/>
+        <a:srgbClr val="ED7D31"/>
       </a:accent2>
       <a:accent3>
-        <a:srgbClr val="a5a5a5"/>
+        <a:srgbClr val="A5A5A5"/>
       </a:accent3>
       <a:accent4>
-        <a:srgbClr val="ffc000"/>
+        <a:srgbClr val="FFC000"/>
       </a:accent4>
       <a:accent5>
-        <a:srgbClr val="4472c4"/>
+        <a:srgbClr val="4472C4"/>
       </a:accent5>
       <a:accent6>
-        <a:srgbClr val="70ad47"/>
+        <a:srgbClr val="70AD47"/>
       </a:accent6>
       <a:hlink>
-        <a:srgbClr val="0563c1"/>
+        <a:srgbClr val="0563C1"/>
       </a:hlink>
       <a:folHlink>
-        <a:srgbClr val="954f72"/>
+        <a:srgbClr val="954F72"/>
       </a:folHlink>
     </a:clrScheme>
     <a:fontScheme name="Office">

</xml_diff>

<commit_message>
Adding back review forms. Added TXT version of the review form
</commit_message>
<xml_diff>
--- a/template/review_template.docx
+++ b/template/review_template.docx
@@ -1,6 +1,6 @@
 
 <file path=word/document.xml><?xml version="1.0" encoding="utf-8"?>
-<w:document xmlns:o="urn:schemas-microsoft-com:office:office" xmlns:r="http://schemas.openxmlformats.org/officeDocument/2006/relationships" xmlns:v="urn:schemas-microsoft-com:vml" xmlns:w="http://schemas.openxmlformats.org/wordprocessingml/2006/main" xmlns:w10="urn:schemas-microsoft-com:office:word" xmlns:wp="http://schemas.openxmlformats.org/drawingml/2006/wordprocessingDrawing" xmlns:pic="http://schemas.openxmlformats.org/drawingml/2006/picture" xmlns:wps="http://schemas.microsoft.com/office/word/2010/wordprocessingShape" xmlns:wpg="http://schemas.microsoft.com/office/word/2010/wordprocessingGroup" xmlns:mc="http://schemas.openxmlformats.org/markup-compatibility/2006" xmlns:wp14="http://schemas.microsoft.com/office/word/2010/wordprocessingDrawing" xmlns:w14="http://schemas.microsoft.com/office/word/2010/wordml" xmlns:w15="http://schemas.microsoft.com/office/word/2012/wordml" mc:Ignorable="w14 wp14 w15">
+<w:document xmlns:o="urn:schemas-microsoft-com:office:office" xmlns:r="http://schemas.openxmlformats.org/officeDocument/2006/relationships" xmlns:v="urn:schemas-microsoft-com:vml" xmlns:w="http://schemas.openxmlformats.org/wordprocessingml/2006/main" xmlns:w10="urn:schemas-microsoft-com:office:word" xmlns:wp="http://schemas.openxmlformats.org/drawingml/2006/wordprocessingDrawing" xmlns:wps="http://schemas.microsoft.com/office/word/2010/wordprocessingShape" xmlns:wpg="http://schemas.microsoft.com/office/word/2010/wordprocessingGroup" xmlns:mc="http://schemas.openxmlformats.org/markup-compatibility/2006" xmlns:wp14="http://schemas.microsoft.com/office/word/2010/wordprocessingDrawing" xmlns:w14="http://schemas.microsoft.com/office/word/2010/wordml" xmlns:w15="http://schemas.microsoft.com/office/word/2012/wordml" mc:Ignorable="w14 wp14 w15">
   <w:body>
     <w:p>
       <w:pPr>
@@ -16,7 +16,7 @@
           <w:bCs/>
           <w:lang w:val="fr-FR"/>
         </w:rPr>
-        <w:t>ICPR’26 – Reproducible Research Label - issue #{id}</w:t>
+        <w:t>ICPR’26 – Reproducible Research Label</w:t>
       </w:r>
     </w:p>
     <w:p>
@@ -267,7 +267,7 @@
     <w:p>
       <w:pPr>
         <w:pStyle w:val="Normal"/>
-        <w:ind w:firstLine="414" w:start="720"/>
+        <w:ind w:firstLine="414" w:left="720"/>
         <w:rPr>
           <w:rFonts w:ascii="Arial" w:hAnsi="Arial" w:cs="Arial"/>
         </w:rPr>
@@ -315,7 +315,7 @@
     <w:p>
       <w:pPr>
         <w:pStyle w:val="Normal"/>
-        <w:ind w:firstLine="414" w:start="720"/>
+        <w:ind w:firstLine="414" w:left="720"/>
         <w:rPr>
           <w:rFonts w:ascii="Arial" w:hAnsi="Arial" w:cs="Arial"/>
         </w:rPr>
@@ -411,7 +411,7 @@
     <w:p>
       <w:pPr>
         <w:pStyle w:val="Normal"/>
-        <w:ind w:firstLine="414" w:start="720"/>
+        <w:ind w:firstLine="414" w:left="720"/>
         <w:rPr>
           <w:rFonts w:ascii="Arial" w:hAnsi="Arial" w:cs="Arial"/>
         </w:rPr>
@@ -458,7 +458,7 @@
     <w:p>
       <w:pPr>
         <w:pStyle w:val="Normal"/>
-        <w:ind w:firstLine="414" w:start="720"/>
+        <w:ind w:firstLine="414" w:left="720"/>
         <w:rPr>
           <w:rFonts w:ascii="Arial" w:hAnsi="Arial" w:cs="Arial"/>
         </w:rPr>
@@ -544,7 +544,7 @@
     <w:p>
       <w:pPr>
         <w:pStyle w:val="Normal"/>
-        <w:ind w:firstLine="414" w:start="720"/>
+        <w:ind w:firstLine="414" w:left="720"/>
         <w:rPr>
           <w:rFonts w:ascii="Arial" w:hAnsi="Arial" w:cs="Arial"/>
         </w:rPr>
@@ -592,7 +592,7 @@
     <w:p>
       <w:pPr>
         <w:pStyle w:val="Normal"/>
-        <w:ind w:firstLine="414" w:start="720"/>
+        <w:ind w:firstLine="414" w:left="720"/>
         <w:rPr>
           <w:rFonts w:ascii="Arial" w:hAnsi="Arial" w:cs="Arial"/>
         </w:rPr>
@@ -678,7 +678,7 @@
     <w:p>
       <w:pPr>
         <w:pStyle w:val="Normal"/>
-        <w:ind w:firstLine="414" w:start="720"/>
+        <w:ind w:firstLine="414" w:left="720"/>
         <w:rPr>
           <w:rFonts w:ascii="Arial" w:hAnsi="Arial" w:cs="Arial"/>
         </w:rPr>
@@ -726,7 +726,7 @@
     <w:p>
       <w:pPr>
         <w:pStyle w:val="Normal"/>
-        <w:ind w:firstLine="414" w:start="720"/>
+        <w:ind w:firstLine="414" w:left="720"/>
         <w:rPr>
           <w:rFonts w:ascii="Arial" w:hAnsi="Arial" w:cs="Arial"/>
         </w:rPr>
@@ -774,7 +774,7 @@
     <w:p>
       <w:pPr>
         <w:pStyle w:val="Normal"/>
-        <w:ind w:firstLine="414" w:start="720"/>
+        <w:ind w:firstLine="414" w:left="720"/>
         <w:rPr>
           <w:rFonts w:ascii="Arial" w:hAnsi="Arial" w:cs="Arial"/>
         </w:rPr>
@@ -816,14 +816,7 @@
           <w:rFonts w:cs="Arial" w:ascii="Arial" w:hAnsi="Arial"/>
           <w:lang w:val="fr-FR"/>
         </w:rPr>
-        <w:t xml:space="preserve">No, essential data </w:t>
-      </w:r>
-      <w:r>
-        <w:rPr>
-          <w:rFonts w:cs="Arial" w:ascii="Arial" w:hAnsi="Arial"/>
-          <w:lang w:val="fr-FR"/>
-        </w:rPr>
-        <w:t>was missing</w:t>
+        <w:t>No, essential data was missing</w:t>
       </w:r>
     </w:p>
     <w:p>
@@ -867,7 +860,7 @@
     <w:p>
       <w:pPr>
         <w:pStyle w:val="Normal"/>
-        <w:ind w:firstLine="142" w:start="992"/>
+        <w:ind w:firstLine="142" w:left="992"/>
         <w:rPr>
           <w:rFonts w:ascii="Arial" w:hAnsi="Arial" w:cs="Arial"/>
         </w:rPr>
@@ -915,7 +908,7 @@
     <w:p>
       <w:pPr>
         <w:pStyle w:val="Normal"/>
-        <w:ind w:firstLine="142" w:start="992"/>
+        <w:ind w:firstLine="142" w:left="992"/>
         <w:rPr>
           <w:rFonts w:ascii="Arial" w:hAnsi="Arial" w:cs="Arial"/>
         </w:rPr>
@@ -963,7 +956,7 @@
     <w:p>
       <w:pPr>
         <w:pStyle w:val="Normal"/>
-        <w:ind w:firstLine="142" w:start="992"/>
+        <w:ind w:firstLine="142" w:left="992"/>
         <w:rPr>
           <w:rFonts w:ascii="Arial" w:hAnsi="Arial" w:cs="Arial"/>
         </w:rPr>
@@ -1005,14 +998,7 @@
           <w:rFonts w:cs="Arial" w:ascii="Arial" w:hAnsi="Arial"/>
           <w:lang w:val="fr-FR"/>
         </w:rPr>
-        <w:t xml:space="preserve">Non, essential data </w:t>
-      </w:r>
-      <w:r>
-        <w:rPr>
-          <w:rFonts w:cs="Arial" w:ascii="Arial" w:hAnsi="Arial"/>
-          <w:lang w:val="fr-FR"/>
-        </w:rPr>
-        <w:t>was missing</w:t>
+        <w:t>Non, essential data was missing</w:t>
       </w:r>
     </w:p>
     <w:p>
@@ -1072,6 +1058,7 @@
         <w:rPr>
           <w:rFonts w:ascii="Arial" w:hAnsi="Arial" w:cs="Arial"/>
           <w:bCs/>
+          <w:i/>
           <w:i/>
         </w:rPr>
       </w:pPr>
@@ -1173,7 +1160,7 @@
     <w:p>
       <w:pPr>
         <w:pStyle w:val="Normal"/>
-        <w:ind w:firstLine="414" w:start="720"/>
+        <w:ind w:firstLine="414" w:left="720"/>
         <w:rPr>
           <w:rFonts w:ascii="Arial" w:hAnsi="Arial" w:cs="Arial"/>
         </w:rPr>
@@ -1221,7 +1208,7 @@
     <w:p>
       <w:pPr>
         <w:pStyle w:val="Normal"/>
-        <w:ind w:firstLine="414" w:start="720"/>
+        <w:ind w:firstLine="414" w:left="720"/>
         <w:rPr>
           <w:rFonts w:ascii="Arial" w:hAnsi="Arial" w:cs="Arial"/>
         </w:rPr>
@@ -1325,7 +1312,7 @@
     <w:p>
       <w:pPr>
         <w:pStyle w:val="Normal"/>
-        <w:ind w:firstLine="414" w:start="720"/>
+        <w:ind w:firstLine="414" w:left="720"/>
         <w:rPr>
           <w:rFonts w:ascii="Arial" w:hAnsi="Arial" w:cs="Arial"/>
         </w:rPr>
@@ -1373,7 +1360,7 @@
     <w:p>
       <w:pPr>
         <w:pStyle w:val="Normal"/>
-        <w:ind w:firstLine="414" w:start="720"/>
+        <w:ind w:firstLine="414" w:left="720"/>
         <w:rPr>
           <w:rFonts w:ascii="Arial" w:hAnsi="Arial" w:cs="Arial"/>
         </w:rPr>
@@ -1421,7 +1408,7 @@
     <w:p>
       <w:pPr>
         <w:pStyle w:val="Normal"/>
-        <w:ind w:firstLine="414" w:start="720"/>
+        <w:ind w:firstLine="414" w:left="720"/>
         <w:rPr>
           <w:rFonts w:ascii="Arial" w:hAnsi="Arial" w:cs="Arial"/>
         </w:rPr>
@@ -1469,7 +1456,7 @@
     <w:p>
       <w:pPr>
         <w:pStyle w:val="Normal"/>
-        <w:ind w:firstLine="414" w:start="720"/>
+        <w:ind w:firstLine="414" w:left="720"/>
         <w:rPr>
           <w:rFonts w:ascii="Arial" w:hAnsi="Arial" w:cs="Arial"/>
         </w:rPr>
@@ -1555,7 +1542,7 @@
     <w:p>
       <w:pPr>
         <w:pStyle w:val="Normal"/>
-        <w:ind w:firstLine="414" w:start="720"/>
+        <w:ind w:firstLine="414" w:left="720"/>
         <w:rPr>
           <w:rFonts w:ascii="Arial" w:hAnsi="Arial" w:cs="Arial"/>
         </w:rPr>
@@ -1603,7 +1590,7 @@
     <w:p>
       <w:pPr>
         <w:pStyle w:val="Normal"/>
-        <w:ind w:firstLine="414" w:start="720"/>
+        <w:ind w:firstLine="414" w:left="720"/>
         <w:rPr>
           <w:rFonts w:ascii="Arial" w:hAnsi="Arial" w:cs="Arial"/>
         </w:rPr>
@@ -1651,7 +1638,7 @@
     <w:p>
       <w:pPr>
         <w:pStyle w:val="Normal"/>
-        <w:ind w:firstLine="414" w:start="720"/>
+        <w:ind w:firstLine="414" w:left="720"/>
         <w:rPr>
           <w:rFonts w:ascii="Arial" w:hAnsi="Arial" w:cs="Arial"/>
         </w:rPr>
@@ -1699,7 +1686,7 @@
     <w:p>
       <w:pPr>
         <w:pStyle w:val="Normal"/>
-        <w:ind w:firstLine="414" w:start="720"/>
+        <w:ind w:firstLine="414" w:left="720"/>
         <w:rPr>
           <w:rFonts w:ascii="Arial" w:hAnsi="Arial" w:cs="Arial"/>
         </w:rPr>
@@ -1785,7 +1772,7 @@
     <w:p>
       <w:pPr>
         <w:pStyle w:val="Normal"/>
-        <w:ind w:firstLine="414" w:start="720"/>
+        <w:ind w:firstLine="414" w:left="720"/>
         <w:rPr>
           <w:rFonts w:ascii="Arial" w:hAnsi="Arial" w:cs="Arial"/>
         </w:rPr>
@@ -1833,7 +1820,7 @@
     <w:p>
       <w:pPr>
         <w:pStyle w:val="Normal"/>
-        <w:ind w:firstLine="414" w:start="720"/>
+        <w:ind w:firstLine="414" w:left="720"/>
         <w:rPr>
           <w:rFonts w:ascii="Arial" w:hAnsi="Arial" w:cs="Arial"/>
         </w:rPr>
@@ -1881,7 +1868,7 @@
     <w:p>
       <w:pPr>
         <w:pStyle w:val="Normal"/>
-        <w:ind w:firstLine="414" w:start="720"/>
+        <w:ind w:firstLine="414" w:left="720"/>
         <w:rPr>
           <w:rFonts w:ascii="Arial" w:hAnsi="Arial" w:cs="Arial"/>
         </w:rPr>
@@ -1923,14 +1910,7 @@
           <w:rFonts w:cs="Arial" w:ascii="Arial" w:hAnsi="Arial"/>
           <w:lang w:val="fr-FR"/>
         </w:rPr>
-        <w:t xml:space="preserve">No, essential data </w:t>
-      </w:r>
-      <w:r>
-        <w:rPr>
-          <w:rFonts w:cs="Arial" w:ascii="Arial" w:hAnsi="Arial"/>
-          <w:lang w:val="fr-FR"/>
-        </w:rPr>
-        <w:t>was missing</w:t>
+        <w:t>No, essential data was missing</w:t>
       </w:r>
     </w:p>
     <w:p>
@@ -2012,7 +1992,7 @@
     <w:p>
       <w:pPr>
         <w:pStyle w:val="Normal"/>
-        <w:ind w:firstLine="414" w:start="720"/>
+        <w:ind w:firstLine="414" w:left="720"/>
         <w:rPr>
           <w:rFonts w:ascii="Arial" w:hAnsi="Arial" w:cs="Arial"/>
         </w:rPr>
@@ -2060,7 +2040,7 @@
     <w:p>
       <w:pPr>
         <w:pStyle w:val="Normal"/>
-        <w:ind w:firstLine="414" w:start="720"/>
+        <w:ind w:firstLine="414" w:left="720"/>
         <w:rPr>
           <w:rFonts w:ascii="Arial" w:hAnsi="Arial" w:cs="Arial"/>
         </w:rPr>
@@ -2108,7 +2088,7 @@
     <w:p>
       <w:pPr>
         <w:pStyle w:val="Normal"/>
-        <w:ind w:firstLine="414" w:start="720"/>
+        <w:ind w:firstLine="414" w:left="720"/>
         <w:rPr>
           <w:rFonts w:ascii="Arial" w:hAnsi="Arial" w:cs="Arial"/>
         </w:rPr>
@@ -2150,21 +2130,7 @@
           <w:rFonts w:cs="Arial" w:ascii="Arial" w:hAnsi="Arial"/>
           <w:lang w:val="fr-FR"/>
         </w:rPr>
-        <w:t>N</w:t>
-      </w:r>
-      <w:r>
-        <w:rPr>
-          <w:rFonts w:cs="Arial" w:ascii="Arial" w:hAnsi="Arial"/>
-          <w:lang w:val="fr-FR"/>
-        </w:rPr>
-        <w:t xml:space="preserve">ot </w:t>
-      </w:r>
-      <w:r>
-        <w:rPr>
-          <w:rFonts w:cs="Arial" w:ascii="Arial" w:hAnsi="Arial"/>
-          <w:lang w:val="fr-FR"/>
-        </w:rPr>
-        <w:t>applicable</w:t>
+        <w:t>Not applicable</w:t>
       </w:r>
     </w:p>
     <w:p>
@@ -2208,7 +2174,7 @@
     <w:p>
       <w:pPr>
         <w:pStyle w:val="Normal"/>
-        <w:ind w:firstLine="414" w:start="720"/>
+        <w:ind w:firstLine="414" w:left="720"/>
         <w:rPr>
           <w:rFonts w:ascii="Arial" w:hAnsi="Arial" w:cs="Arial"/>
         </w:rPr>
@@ -2256,7 +2222,7 @@
     <w:p>
       <w:pPr>
         <w:pStyle w:val="Normal"/>
-        <w:ind w:firstLine="414" w:start="720"/>
+        <w:ind w:firstLine="414" w:left="720"/>
         <w:rPr>
           <w:rFonts w:ascii="Arial" w:hAnsi="Arial" w:cs="Arial"/>
         </w:rPr>
@@ -2382,7 +2348,7 @@
     <w:p>
       <w:pPr>
         <w:pStyle w:val="Normal"/>
-        <w:ind w:firstLine="414" w:start="720"/>
+        <w:ind w:firstLine="414" w:left="720"/>
         <w:rPr>
           <w:rFonts w:ascii="Arial" w:hAnsi="Arial" w:cs="Arial"/>
         </w:rPr>
@@ -2430,7 +2396,7 @@
     <w:p>
       <w:pPr>
         <w:pStyle w:val="Normal"/>
-        <w:ind w:firstLine="414" w:start="720"/>
+        <w:ind w:firstLine="414" w:left="720"/>
         <w:rPr>
           <w:rFonts w:ascii="Arial" w:hAnsi="Arial" w:cs="Arial"/>
         </w:rPr>
@@ -2478,7 +2444,7 @@
     <w:p>
       <w:pPr>
         <w:pStyle w:val="Normal"/>
-        <w:ind w:firstLine="414" w:start="720"/>
+        <w:ind w:firstLine="414" w:left="720"/>
         <w:rPr>
           <w:rFonts w:ascii="Arial" w:hAnsi="Arial" w:cs="Arial"/>
         </w:rPr>
@@ -2526,7 +2492,7 @@
     <w:p>
       <w:pPr>
         <w:pStyle w:val="Normal"/>
-        <w:ind w:firstLine="414" w:start="720"/>
+        <w:ind w:firstLine="414" w:left="720"/>
         <w:rPr>
           <w:rFonts w:ascii="Arial" w:hAnsi="Arial" w:cs="Arial"/>
         </w:rPr>
@@ -2608,7 +2574,7 @@
     <w:p>
       <w:pPr>
         <w:pStyle w:val="Normal"/>
-        <w:ind w:firstLine="414" w:start="720"/>
+        <w:ind w:firstLine="414" w:left="720"/>
         <w:rPr>
           <w:rFonts w:ascii="Arial" w:hAnsi="Arial" w:cs="Arial"/>
         </w:rPr>
@@ -2656,7 +2622,7 @@
     <w:p>
       <w:pPr>
         <w:pStyle w:val="Normal"/>
-        <w:ind w:firstLine="414" w:start="720"/>
+        <w:ind w:firstLine="414" w:left="720"/>
         <w:rPr>
           <w:rFonts w:ascii="Arial" w:hAnsi="Arial" w:cs="Arial"/>
         </w:rPr>
@@ -2704,7 +2670,7 @@
     <w:p>
       <w:pPr>
         <w:pStyle w:val="Normal"/>
-        <w:ind w:firstLine="414" w:start="720"/>
+        <w:ind w:firstLine="414" w:left="720"/>
         <w:rPr>
           <w:rFonts w:ascii="Arial" w:hAnsi="Arial" w:cs="Arial"/>
         </w:rPr>
@@ -2790,7 +2756,7 @@
     <w:p>
       <w:pPr>
         <w:pStyle w:val="Normal"/>
-        <w:ind w:firstLine="414" w:start="720"/>
+        <w:ind w:firstLine="414" w:left="720"/>
         <w:rPr>
           <w:rFonts w:ascii="Arial" w:hAnsi="Arial" w:cs="Arial"/>
         </w:rPr>
@@ -2838,7 +2804,7 @@
     <w:p>
       <w:pPr>
         <w:pStyle w:val="Normal"/>
-        <w:ind w:firstLine="414" w:start="720"/>
+        <w:ind w:firstLine="414" w:left="720"/>
         <w:rPr>
           <w:rFonts w:ascii="Arial" w:hAnsi="Arial" w:cs="Arial"/>
         </w:rPr>
@@ -2886,7 +2852,7 @@
     <w:p>
       <w:pPr>
         <w:pStyle w:val="Normal"/>
-        <w:ind w:firstLine="414" w:start="720"/>
+        <w:ind w:firstLine="414" w:left="720"/>
         <w:rPr>
           <w:rFonts w:ascii="Arial" w:hAnsi="Arial" w:cs="Arial"/>
         </w:rPr>
@@ -2938,7 +2904,7 @@
           <w:ilvl w:val="0"/>
           <w:numId w:val="0"/>
         </w:numPr>
-        <w:ind w:hanging="0" w:start="0"/>
+        <w:ind w:hanging="0" w:left="0"/>
         <w:rPr/>
       </w:pPr>
       <w:r>
@@ -2982,7 +2948,7 @@
     <w:p>
       <w:pPr>
         <w:pStyle w:val="Normal"/>
-        <w:ind w:firstLine="414" w:start="720"/>
+        <w:ind w:firstLine="414" w:left="720"/>
         <w:rPr>
           <w:rFonts w:ascii="Arial" w:hAnsi="Arial" w:cs="Arial"/>
         </w:rPr>
@@ -3030,7 +2996,7 @@
     <w:p>
       <w:pPr>
         <w:pStyle w:val="Normal"/>
-        <w:ind w:firstLine="414" w:start="720"/>
+        <w:ind w:firstLine="414" w:left="720"/>
         <w:rPr>
           <w:rFonts w:ascii="Arial" w:hAnsi="Arial" w:cs="Arial"/>
         </w:rPr>
@@ -3078,7 +3044,7 @@
     <w:p>
       <w:pPr>
         <w:pStyle w:val="Normal"/>
-        <w:ind w:firstLine="414" w:start="720"/>
+        <w:ind w:firstLine="414" w:left="720"/>
         <w:rPr>
           <w:rFonts w:ascii="Arial" w:hAnsi="Arial" w:cs="Arial"/>
         </w:rPr>
@@ -3126,7 +3092,7 @@
     <w:p>
       <w:pPr>
         <w:pStyle w:val="Normal"/>
-        <w:ind w:firstLine="414" w:start="720"/>
+        <w:ind w:firstLine="414" w:left="720"/>
         <w:rPr>
           <w:rFonts w:ascii="Arial" w:hAnsi="Arial" w:cs="Arial"/>
         </w:rPr>
@@ -3469,15 +3435,15 @@
   <w:abstractNum w:abstractNumId="1">
     <w:lvl w:ilvl="0">
       <w:start w:val="1"/>
+      <w:isLgl/>
       <w:numFmt w:val="bullet"/>
-      <w:isLgl/>
       <w:lvlText w:val="·"/>
-      <w:lvlJc w:val="start"/>
-      <w:pPr>
-        <w:tabs>
-          <w:tab w:val="num" w:pos="0"/>
-        </w:tabs>
-        <w:ind w:start="720" w:hanging="360"/>
+      <w:lvlJc w:val="left"/>
+      <w:pPr>
+        <w:tabs>
+          <w:tab w:val="num" w:pos="0"/>
+        </w:tabs>
+        <w:ind w:left="720" w:hanging="360"/>
       </w:pPr>
       <w:rPr>
         <w:rFonts w:ascii="Symbol" w:hAnsi="Symbol" w:cs="Symbol" w:hint="default"/>
@@ -3485,15 +3451,15 @@
     </w:lvl>
     <w:lvl w:ilvl="1">
       <w:start w:val="1"/>
+      <w:isLgl/>
       <w:numFmt w:val="bullet"/>
-      <w:isLgl/>
       <w:lvlText w:val="·"/>
-      <w:lvlJc w:val="start"/>
-      <w:pPr>
-        <w:tabs>
-          <w:tab w:val="num" w:pos="0"/>
-        </w:tabs>
-        <w:ind w:start="1440" w:hanging="360"/>
+      <w:lvlJc w:val="left"/>
+      <w:pPr>
+        <w:tabs>
+          <w:tab w:val="num" w:pos="0"/>
+        </w:tabs>
+        <w:ind w:left="1440" w:hanging="360"/>
       </w:pPr>
       <w:rPr>
         <w:rFonts w:ascii="Symbol" w:hAnsi="Symbol" w:cs="Symbol" w:hint="default"/>
@@ -3501,15 +3467,15 @@
     </w:lvl>
     <w:lvl w:ilvl="2">
       <w:start w:val="1"/>
+      <w:isLgl/>
       <w:numFmt w:val="bullet"/>
-      <w:isLgl/>
       <w:lvlText w:val="§"/>
-      <w:lvlJc w:val="start"/>
-      <w:pPr>
-        <w:tabs>
-          <w:tab w:val="num" w:pos="0"/>
-        </w:tabs>
-        <w:ind w:start="2160" w:hanging="360"/>
+      <w:lvlJc w:val="left"/>
+      <w:pPr>
+        <w:tabs>
+          <w:tab w:val="num" w:pos="0"/>
+        </w:tabs>
+        <w:ind w:left="2160" w:hanging="360"/>
       </w:pPr>
       <w:rPr>
         <w:rFonts w:ascii="Wingdings" w:hAnsi="Wingdings" w:cs="Wingdings" w:hint="default"/>
@@ -3517,15 +3483,15 @@
     </w:lvl>
     <w:lvl w:ilvl="3">
       <w:start w:val="1"/>
+      <w:isLgl/>
       <w:numFmt w:val="bullet"/>
-      <w:isLgl/>
       <w:lvlText w:val="·"/>
-      <w:lvlJc w:val="start"/>
-      <w:pPr>
-        <w:tabs>
-          <w:tab w:val="num" w:pos="0"/>
-        </w:tabs>
-        <w:ind w:start="2880" w:hanging="360"/>
+      <w:lvlJc w:val="left"/>
+      <w:pPr>
+        <w:tabs>
+          <w:tab w:val="num" w:pos="0"/>
+        </w:tabs>
+        <w:ind w:left="2880" w:hanging="360"/>
       </w:pPr>
       <w:rPr>
         <w:rFonts w:ascii="Symbol" w:hAnsi="Symbol" w:cs="Symbol" w:hint="default"/>
@@ -3533,15 +3499,15 @@
     </w:lvl>
     <w:lvl w:ilvl="4">
       <w:start w:val="1"/>
+      <w:isLgl/>
       <w:numFmt w:val="bullet"/>
-      <w:isLgl/>
       <w:lvlText w:val="o"/>
-      <w:lvlJc w:val="start"/>
-      <w:pPr>
-        <w:tabs>
-          <w:tab w:val="num" w:pos="0"/>
-        </w:tabs>
-        <w:ind w:start="3600" w:hanging="360"/>
+      <w:lvlJc w:val="left"/>
+      <w:pPr>
+        <w:tabs>
+          <w:tab w:val="num" w:pos="0"/>
+        </w:tabs>
+        <w:ind w:left="3600" w:hanging="360"/>
       </w:pPr>
       <w:rPr>
         <w:rFonts w:ascii="Courier New" w:hAnsi="Courier New" w:cs="Courier New" w:hint="default"/>
@@ -3549,15 +3515,15 @@
     </w:lvl>
     <w:lvl w:ilvl="5">
       <w:start w:val="1"/>
+      <w:isLgl/>
       <w:numFmt w:val="bullet"/>
-      <w:isLgl/>
       <w:lvlText w:val="§"/>
-      <w:lvlJc w:val="start"/>
-      <w:pPr>
-        <w:tabs>
-          <w:tab w:val="num" w:pos="0"/>
-        </w:tabs>
-        <w:ind w:start="4320" w:hanging="360"/>
+      <w:lvlJc w:val="left"/>
+      <w:pPr>
+        <w:tabs>
+          <w:tab w:val="num" w:pos="0"/>
+        </w:tabs>
+        <w:ind w:left="4320" w:hanging="360"/>
       </w:pPr>
       <w:rPr>
         <w:rFonts w:ascii="Wingdings" w:hAnsi="Wingdings" w:cs="Wingdings" w:hint="default"/>
@@ -3565,15 +3531,15 @@
     </w:lvl>
     <w:lvl w:ilvl="6">
       <w:start w:val="1"/>
+      <w:isLgl/>
       <w:numFmt w:val="bullet"/>
-      <w:isLgl/>
       <w:lvlText w:val="·"/>
-      <w:lvlJc w:val="start"/>
-      <w:pPr>
-        <w:tabs>
-          <w:tab w:val="num" w:pos="0"/>
-        </w:tabs>
-        <w:ind w:start="5040" w:hanging="360"/>
+      <w:lvlJc w:val="left"/>
+      <w:pPr>
+        <w:tabs>
+          <w:tab w:val="num" w:pos="0"/>
+        </w:tabs>
+        <w:ind w:left="5040" w:hanging="360"/>
       </w:pPr>
       <w:rPr>
         <w:rFonts w:ascii="Symbol" w:hAnsi="Symbol" w:cs="Symbol" w:hint="default"/>
@@ -3581,15 +3547,15 @@
     </w:lvl>
     <w:lvl w:ilvl="7">
       <w:start w:val="1"/>
+      <w:isLgl/>
       <w:numFmt w:val="bullet"/>
-      <w:isLgl/>
       <w:lvlText w:val="o"/>
-      <w:lvlJc w:val="start"/>
-      <w:pPr>
-        <w:tabs>
-          <w:tab w:val="num" w:pos="0"/>
-        </w:tabs>
-        <w:ind w:start="5760" w:hanging="360"/>
+      <w:lvlJc w:val="left"/>
+      <w:pPr>
+        <w:tabs>
+          <w:tab w:val="num" w:pos="0"/>
+        </w:tabs>
+        <w:ind w:left="5760" w:hanging="360"/>
       </w:pPr>
       <w:rPr>
         <w:rFonts w:ascii="Courier New" w:hAnsi="Courier New" w:cs="Courier New" w:hint="default"/>
@@ -3597,15 +3563,15 @@
     </w:lvl>
     <w:lvl w:ilvl="8">
       <w:start w:val="1"/>
+      <w:isLgl/>
       <w:numFmt w:val="bullet"/>
-      <w:isLgl/>
       <w:lvlText w:val="§"/>
-      <w:lvlJc w:val="start"/>
-      <w:pPr>
-        <w:tabs>
-          <w:tab w:val="num" w:pos="0"/>
-        </w:tabs>
-        <w:ind w:start="6480" w:hanging="360"/>
+      <w:lvlJc w:val="left"/>
+      <w:pPr>
+        <w:tabs>
+          <w:tab w:val="num" w:pos="0"/>
+        </w:tabs>
+        <w:ind w:left="6480" w:hanging="360"/>
       </w:pPr>
       <w:rPr>
         <w:rFonts w:ascii="Wingdings" w:hAnsi="Wingdings" w:cs="Wingdings" w:hint="default"/>
@@ -3615,15 +3581,15 @@
   <w:abstractNum w:abstractNumId="2">
     <w:lvl w:ilvl="0">
       <w:start w:val="1"/>
+      <w:isLgl/>
       <w:numFmt w:val="bullet"/>
-      <w:isLgl/>
       <w:lvlText w:val="·"/>
-      <w:lvlJc w:val="start"/>
-      <w:pPr>
-        <w:tabs>
-          <w:tab w:val="num" w:pos="0"/>
-        </w:tabs>
-        <w:ind w:start="720" w:hanging="360"/>
+      <w:lvlJc w:val="left"/>
+      <w:pPr>
+        <w:tabs>
+          <w:tab w:val="num" w:pos="0"/>
+        </w:tabs>
+        <w:ind w:left="720" w:hanging="360"/>
       </w:pPr>
       <w:rPr>
         <w:rFonts w:ascii="Symbol" w:hAnsi="Symbol" w:cs="Symbol" w:hint="default"/>
@@ -3631,15 +3597,15 @@
     </w:lvl>
     <w:lvl w:ilvl="1">
       <w:start w:val="1"/>
+      <w:isLgl/>
       <w:numFmt w:val="bullet"/>
-      <w:isLgl/>
       <w:lvlText w:val="o"/>
-      <w:lvlJc w:val="start"/>
-      <w:pPr>
-        <w:tabs>
-          <w:tab w:val="num" w:pos="0"/>
-        </w:tabs>
-        <w:ind w:start="1440" w:hanging="360"/>
+      <w:lvlJc w:val="left"/>
+      <w:pPr>
+        <w:tabs>
+          <w:tab w:val="num" w:pos="0"/>
+        </w:tabs>
+        <w:ind w:left="1440" w:hanging="360"/>
       </w:pPr>
       <w:rPr>
         <w:rFonts w:ascii="Courier New" w:hAnsi="Courier New" w:cs="Courier New" w:hint="default"/>
@@ -3647,15 +3613,15 @@
     </w:lvl>
     <w:lvl w:ilvl="2">
       <w:start w:val="1"/>
+      <w:isLgl/>
       <w:numFmt w:val="bullet"/>
-      <w:isLgl/>
       <w:lvlText w:val="§"/>
-      <w:lvlJc w:val="start"/>
-      <w:pPr>
-        <w:tabs>
-          <w:tab w:val="num" w:pos="0"/>
-        </w:tabs>
-        <w:ind w:start="2160" w:hanging="360"/>
+      <w:lvlJc w:val="left"/>
+      <w:pPr>
+        <w:tabs>
+          <w:tab w:val="num" w:pos="0"/>
+        </w:tabs>
+        <w:ind w:left="2160" w:hanging="360"/>
       </w:pPr>
       <w:rPr>
         <w:rFonts w:ascii="Wingdings" w:hAnsi="Wingdings" w:cs="Wingdings" w:hint="default"/>
@@ -3663,15 +3629,15 @@
     </w:lvl>
     <w:lvl w:ilvl="3">
       <w:start w:val="1"/>
+      <w:isLgl/>
       <w:numFmt w:val="bullet"/>
-      <w:isLgl/>
       <w:lvlText w:val="·"/>
-      <w:lvlJc w:val="start"/>
-      <w:pPr>
-        <w:tabs>
-          <w:tab w:val="num" w:pos="0"/>
-        </w:tabs>
-        <w:ind w:start="2880" w:hanging="360"/>
+      <w:lvlJc w:val="left"/>
+      <w:pPr>
+        <w:tabs>
+          <w:tab w:val="num" w:pos="0"/>
+        </w:tabs>
+        <w:ind w:left="2880" w:hanging="360"/>
       </w:pPr>
       <w:rPr>
         <w:rFonts w:ascii="Symbol" w:hAnsi="Symbol" w:cs="Symbol" w:hint="default"/>
@@ -3679,15 +3645,15 @@
     </w:lvl>
     <w:lvl w:ilvl="4">
       <w:start w:val="1"/>
+      <w:isLgl/>
       <w:numFmt w:val="bullet"/>
-      <w:isLgl/>
       <w:lvlText w:val="o"/>
-      <w:lvlJc w:val="start"/>
-      <w:pPr>
-        <w:tabs>
-          <w:tab w:val="num" w:pos="0"/>
-        </w:tabs>
-        <w:ind w:start="3600" w:hanging="360"/>
+      <w:lvlJc w:val="left"/>
+      <w:pPr>
+        <w:tabs>
+          <w:tab w:val="num" w:pos="0"/>
+        </w:tabs>
+        <w:ind w:left="3600" w:hanging="360"/>
       </w:pPr>
       <w:rPr>
         <w:rFonts w:ascii="Courier New" w:hAnsi="Courier New" w:cs="Courier New" w:hint="default"/>
@@ -3695,15 +3661,15 @@
     </w:lvl>
     <w:lvl w:ilvl="5">
       <w:start w:val="1"/>
+      <w:isLgl/>
       <w:numFmt w:val="bullet"/>
-      <w:isLgl/>
       <w:lvlText w:val="§"/>
-      <w:lvlJc w:val="start"/>
-      <w:pPr>
-        <w:tabs>
-          <w:tab w:val="num" w:pos="0"/>
-        </w:tabs>
-        <w:ind w:start="4320" w:hanging="360"/>
+      <w:lvlJc w:val="left"/>
+      <w:pPr>
+        <w:tabs>
+          <w:tab w:val="num" w:pos="0"/>
+        </w:tabs>
+        <w:ind w:left="4320" w:hanging="360"/>
       </w:pPr>
       <w:rPr>
         <w:rFonts w:ascii="Wingdings" w:hAnsi="Wingdings" w:cs="Wingdings" w:hint="default"/>
@@ -3711,15 +3677,15 @@
     </w:lvl>
     <w:lvl w:ilvl="6">
       <w:start w:val="1"/>
+      <w:isLgl/>
       <w:numFmt w:val="bullet"/>
-      <w:isLgl/>
       <w:lvlText w:val="·"/>
-      <w:lvlJc w:val="start"/>
-      <w:pPr>
-        <w:tabs>
-          <w:tab w:val="num" w:pos="0"/>
-        </w:tabs>
-        <w:ind w:start="5040" w:hanging="360"/>
+      <w:lvlJc w:val="left"/>
+      <w:pPr>
+        <w:tabs>
+          <w:tab w:val="num" w:pos="0"/>
+        </w:tabs>
+        <w:ind w:left="5040" w:hanging="360"/>
       </w:pPr>
       <w:rPr>
         <w:rFonts w:ascii="Symbol" w:hAnsi="Symbol" w:cs="Symbol" w:hint="default"/>
@@ -3727,15 +3693,15 @@
     </w:lvl>
     <w:lvl w:ilvl="7">
       <w:start w:val="1"/>
+      <w:isLgl/>
       <w:numFmt w:val="bullet"/>
-      <w:isLgl/>
       <w:lvlText w:val="o"/>
-      <w:lvlJc w:val="start"/>
-      <w:pPr>
-        <w:tabs>
-          <w:tab w:val="num" w:pos="0"/>
-        </w:tabs>
-        <w:ind w:start="5760" w:hanging="360"/>
+      <w:lvlJc w:val="left"/>
+      <w:pPr>
+        <w:tabs>
+          <w:tab w:val="num" w:pos="0"/>
+        </w:tabs>
+        <w:ind w:left="5760" w:hanging="360"/>
       </w:pPr>
       <w:rPr>
         <w:rFonts w:ascii="Courier New" w:hAnsi="Courier New" w:cs="Courier New" w:hint="default"/>
@@ -3743,15 +3709,15 @@
     </w:lvl>
     <w:lvl w:ilvl="8">
       <w:start w:val="1"/>
+      <w:isLgl/>
       <w:numFmt w:val="bullet"/>
-      <w:isLgl/>
       <w:lvlText w:val="§"/>
-      <w:lvlJc w:val="start"/>
-      <w:pPr>
-        <w:tabs>
-          <w:tab w:val="num" w:pos="0"/>
-        </w:tabs>
-        <w:ind w:start="6480" w:hanging="360"/>
+      <w:lvlJc w:val="left"/>
+      <w:pPr>
+        <w:tabs>
+          <w:tab w:val="num" w:pos="0"/>
+        </w:tabs>
+        <w:ind w:left="6480" w:hanging="360"/>
       </w:pPr>
       <w:rPr>
         <w:rFonts w:ascii="Wingdings" w:hAnsi="Wingdings" w:cs="Wingdings" w:hint="default"/>
@@ -3761,127 +3727,127 @@
   <w:abstractNum w:abstractNumId="3">
     <w:lvl w:ilvl="0">
       <w:start w:val="1"/>
+      <w:isLgl/>
       <w:numFmt w:val="decimal"/>
+      <w:lvlText w:val="%1."/>
+      <w:lvlJc w:val="left"/>
+      <w:pPr>
+        <w:tabs>
+          <w:tab w:val="num" w:pos="0"/>
+        </w:tabs>
+        <w:ind w:left="720" w:hanging="360"/>
+      </w:pPr>
+      <w:rPr/>
+    </w:lvl>
+    <w:lvl w:ilvl="1">
+      <w:start w:val="1"/>
       <w:isLgl/>
-      <w:lvlText w:val="%1."/>
-      <w:lvlJc w:val="start"/>
-      <w:pPr>
-        <w:tabs>
-          <w:tab w:val="num" w:pos="0"/>
-        </w:tabs>
-        <w:ind w:start="720" w:hanging="360"/>
+      <w:numFmt w:val="lowerLetter"/>
+      <w:lvlText w:val="%2."/>
+      <w:lvlJc w:val="left"/>
+      <w:pPr>
+        <w:tabs>
+          <w:tab w:val="num" w:pos="0"/>
+        </w:tabs>
+        <w:ind w:left="1440" w:hanging="360"/>
       </w:pPr>
       <w:rPr/>
     </w:lvl>
-    <w:lvl w:ilvl="1">
-      <w:start w:val="1"/>
+    <w:lvl w:ilvl="2">
+      <w:start w:val="1"/>
+      <w:isLgl/>
+      <w:numFmt w:val="lowerRoman"/>
+      <w:lvlText w:val="%3."/>
+      <w:lvlJc w:val="right"/>
+      <w:pPr>
+        <w:tabs>
+          <w:tab w:val="num" w:pos="0"/>
+        </w:tabs>
+        <w:ind w:left="2160" w:hanging="180"/>
+      </w:pPr>
+      <w:rPr/>
+    </w:lvl>
+    <w:lvl w:ilvl="3">
+      <w:start w:val="1"/>
+      <w:isLgl/>
+      <w:numFmt w:val="decimal"/>
+      <w:lvlText w:val="%4."/>
+      <w:lvlJc w:val="left"/>
+      <w:pPr>
+        <w:tabs>
+          <w:tab w:val="num" w:pos="0"/>
+        </w:tabs>
+        <w:ind w:left="2880" w:hanging="360"/>
+      </w:pPr>
+      <w:rPr/>
+    </w:lvl>
+    <w:lvl w:ilvl="4">
+      <w:start w:val="1"/>
+      <w:isLgl/>
       <w:numFmt w:val="lowerLetter"/>
+      <w:lvlText w:val="%5."/>
+      <w:lvlJc w:val="left"/>
+      <w:pPr>
+        <w:tabs>
+          <w:tab w:val="num" w:pos="0"/>
+        </w:tabs>
+        <w:ind w:left="3600" w:hanging="360"/>
+      </w:pPr>
+      <w:rPr/>
+    </w:lvl>
+    <w:lvl w:ilvl="5">
+      <w:start w:val="1"/>
       <w:isLgl/>
-      <w:lvlText w:val="%2."/>
-      <w:lvlJc w:val="start"/>
-      <w:pPr>
-        <w:tabs>
-          <w:tab w:val="num" w:pos="0"/>
-        </w:tabs>
-        <w:ind w:start="1440" w:hanging="360"/>
+      <w:numFmt w:val="lowerRoman"/>
+      <w:lvlText w:val="%6."/>
+      <w:lvlJc w:val="right"/>
+      <w:pPr>
+        <w:tabs>
+          <w:tab w:val="num" w:pos="0"/>
+        </w:tabs>
+        <w:ind w:left="4320" w:hanging="180"/>
       </w:pPr>
       <w:rPr/>
     </w:lvl>
-    <w:lvl w:ilvl="2">
-      <w:start w:val="1"/>
+    <w:lvl w:ilvl="6">
+      <w:start w:val="1"/>
+      <w:isLgl/>
+      <w:numFmt w:val="decimal"/>
+      <w:lvlText w:val="%7."/>
+      <w:lvlJc w:val="left"/>
+      <w:pPr>
+        <w:tabs>
+          <w:tab w:val="num" w:pos="0"/>
+        </w:tabs>
+        <w:ind w:left="5040" w:hanging="360"/>
+      </w:pPr>
+      <w:rPr/>
+    </w:lvl>
+    <w:lvl w:ilvl="7">
+      <w:start w:val="1"/>
+      <w:isLgl/>
+      <w:numFmt w:val="lowerLetter"/>
+      <w:lvlText w:val="%8."/>
+      <w:lvlJc w:val="left"/>
+      <w:pPr>
+        <w:tabs>
+          <w:tab w:val="num" w:pos="0"/>
+        </w:tabs>
+        <w:ind w:left="5760" w:hanging="360"/>
+      </w:pPr>
+      <w:rPr/>
+    </w:lvl>
+    <w:lvl w:ilvl="8">
+      <w:start w:val="1"/>
+      <w:isLgl/>
       <w:numFmt w:val="lowerRoman"/>
-      <w:isLgl/>
-      <w:lvlText w:val="%3."/>
-      <w:lvlJc w:val="end"/>
-      <w:pPr>
-        <w:tabs>
-          <w:tab w:val="num" w:pos="0"/>
-        </w:tabs>
-        <w:ind w:start="2160" w:hanging="180"/>
-      </w:pPr>
-      <w:rPr/>
-    </w:lvl>
-    <w:lvl w:ilvl="3">
-      <w:start w:val="1"/>
-      <w:numFmt w:val="decimal"/>
-      <w:isLgl/>
-      <w:lvlText w:val="%4."/>
-      <w:lvlJc w:val="start"/>
-      <w:pPr>
-        <w:tabs>
-          <w:tab w:val="num" w:pos="0"/>
-        </w:tabs>
-        <w:ind w:start="2880" w:hanging="360"/>
-      </w:pPr>
-      <w:rPr/>
-    </w:lvl>
-    <w:lvl w:ilvl="4">
-      <w:start w:val="1"/>
-      <w:numFmt w:val="lowerLetter"/>
-      <w:isLgl/>
-      <w:lvlText w:val="%5."/>
-      <w:lvlJc w:val="start"/>
-      <w:pPr>
-        <w:tabs>
-          <w:tab w:val="num" w:pos="0"/>
-        </w:tabs>
-        <w:ind w:start="3600" w:hanging="360"/>
-      </w:pPr>
-      <w:rPr/>
-    </w:lvl>
-    <w:lvl w:ilvl="5">
-      <w:start w:val="1"/>
-      <w:numFmt w:val="lowerRoman"/>
-      <w:isLgl/>
-      <w:lvlText w:val="%6."/>
-      <w:lvlJc w:val="end"/>
-      <w:pPr>
-        <w:tabs>
-          <w:tab w:val="num" w:pos="0"/>
-        </w:tabs>
-        <w:ind w:start="4320" w:hanging="180"/>
-      </w:pPr>
-      <w:rPr/>
-    </w:lvl>
-    <w:lvl w:ilvl="6">
-      <w:start w:val="1"/>
-      <w:numFmt w:val="decimal"/>
-      <w:isLgl/>
-      <w:lvlText w:val="%7."/>
-      <w:lvlJc w:val="start"/>
-      <w:pPr>
-        <w:tabs>
-          <w:tab w:val="num" w:pos="0"/>
-        </w:tabs>
-        <w:ind w:start="5040" w:hanging="360"/>
-      </w:pPr>
-      <w:rPr/>
-    </w:lvl>
-    <w:lvl w:ilvl="7">
-      <w:start w:val="1"/>
-      <w:numFmt w:val="lowerLetter"/>
-      <w:isLgl/>
-      <w:lvlText w:val="%8."/>
-      <w:lvlJc w:val="start"/>
-      <w:pPr>
-        <w:tabs>
-          <w:tab w:val="num" w:pos="0"/>
-        </w:tabs>
-        <w:ind w:start="5760" w:hanging="360"/>
-      </w:pPr>
-      <w:rPr/>
-    </w:lvl>
-    <w:lvl w:ilvl="8">
-      <w:start w:val="1"/>
-      <w:numFmt w:val="lowerRoman"/>
-      <w:isLgl/>
       <w:lvlText w:val="%9."/>
-      <w:lvlJc w:val="end"/>
-      <w:pPr>
-        <w:tabs>
-          <w:tab w:val="num" w:pos="0"/>
-        </w:tabs>
-        <w:ind w:start="6480" w:hanging="180"/>
+      <w:lvlJc w:val="right"/>
+      <w:pPr>
+        <w:tabs>
+          <w:tab w:val="num" w:pos="0"/>
+        </w:tabs>
+        <w:ind w:left="6480" w:hanging="180"/>
       </w:pPr>
       <w:rPr/>
     </w:lvl>
@@ -3889,15 +3855,15 @@
   <w:abstractNum w:abstractNumId="4">
     <w:lvl w:ilvl="0">
       <w:start w:val="1"/>
+      <w:isLgl/>
       <w:numFmt w:val="bullet"/>
-      <w:isLgl/>
       <w:lvlText w:val="·"/>
-      <w:lvlJc w:val="start"/>
-      <w:pPr>
-        <w:tabs>
-          <w:tab w:val="num" w:pos="0"/>
-        </w:tabs>
-        <w:ind w:start="720" w:hanging="360"/>
+      <w:lvlJc w:val="left"/>
+      <w:pPr>
+        <w:tabs>
+          <w:tab w:val="num" w:pos="0"/>
+        </w:tabs>
+        <w:ind w:left="720" w:hanging="360"/>
       </w:pPr>
       <w:rPr>
         <w:rFonts w:ascii="Symbol" w:hAnsi="Symbol" w:cs="Symbol" w:hint="default"/>
@@ -3905,15 +3871,15 @@
     </w:lvl>
     <w:lvl w:ilvl="1">
       <w:start w:val="1"/>
+      <w:isLgl/>
       <w:numFmt w:val="bullet"/>
-      <w:isLgl/>
       <w:lvlText w:val="o"/>
-      <w:lvlJc w:val="start"/>
-      <w:pPr>
-        <w:tabs>
-          <w:tab w:val="num" w:pos="0"/>
-        </w:tabs>
-        <w:ind w:start="1440" w:hanging="360"/>
+      <w:lvlJc w:val="left"/>
+      <w:pPr>
+        <w:tabs>
+          <w:tab w:val="num" w:pos="0"/>
+        </w:tabs>
+        <w:ind w:left="1440" w:hanging="360"/>
       </w:pPr>
       <w:rPr>
         <w:rFonts w:ascii="Courier New" w:hAnsi="Courier New" w:cs="Courier New" w:hint="default"/>
@@ -3921,15 +3887,15 @@
     </w:lvl>
     <w:lvl w:ilvl="2">
       <w:start w:val="1"/>
+      <w:isLgl/>
       <w:numFmt w:val="bullet"/>
-      <w:isLgl/>
       <w:lvlText w:val="§"/>
-      <w:lvlJc w:val="start"/>
-      <w:pPr>
-        <w:tabs>
-          <w:tab w:val="num" w:pos="0"/>
-        </w:tabs>
-        <w:ind w:start="2160" w:hanging="360"/>
+      <w:lvlJc w:val="left"/>
+      <w:pPr>
+        <w:tabs>
+          <w:tab w:val="num" w:pos="0"/>
+        </w:tabs>
+        <w:ind w:left="2160" w:hanging="360"/>
       </w:pPr>
       <w:rPr>
         <w:rFonts w:ascii="Wingdings" w:hAnsi="Wingdings" w:cs="Wingdings" w:hint="default"/>
@@ -3937,15 +3903,15 @@
     </w:lvl>
     <w:lvl w:ilvl="3">
       <w:start w:val="1"/>
+      <w:isLgl/>
       <w:numFmt w:val="bullet"/>
-      <w:isLgl/>
       <w:lvlText w:val="·"/>
-      <w:lvlJc w:val="start"/>
-      <w:pPr>
-        <w:tabs>
-          <w:tab w:val="num" w:pos="0"/>
-        </w:tabs>
-        <w:ind w:start="2880" w:hanging="360"/>
+      <w:lvlJc w:val="left"/>
+      <w:pPr>
+        <w:tabs>
+          <w:tab w:val="num" w:pos="0"/>
+        </w:tabs>
+        <w:ind w:left="2880" w:hanging="360"/>
       </w:pPr>
       <w:rPr>
         <w:rFonts w:ascii="Symbol" w:hAnsi="Symbol" w:cs="Symbol" w:hint="default"/>
@@ -3953,15 +3919,15 @@
     </w:lvl>
     <w:lvl w:ilvl="4">
       <w:start w:val="1"/>
+      <w:isLgl/>
       <w:numFmt w:val="bullet"/>
-      <w:isLgl/>
       <w:lvlText w:val="o"/>
-      <w:lvlJc w:val="start"/>
-      <w:pPr>
-        <w:tabs>
-          <w:tab w:val="num" w:pos="0"/>
-        </w:tabs>
-        <w:ind w:start="3600" w:hanging="360"/>
+      <w:lvlJc w:val="left"/>
+      <w:pPr>
+        <w:tabs>
+          <w:tab w:val="num" w:pos="0"/>
+        </w:tabs>
+        <w:ind w:left="3600" w:hanging="360"/>
       </w:pPr>
       <w:rPr>
         <w:rFonts w:ascii="Courier New" w:hAnsi="Courier New" w:cs="Courier New" w:hint="default"/>
@@ -3969,15 +3935,15 @@
     </w:lvl>
     <w:lvl w:ilvl="5">
       <w:start w:val="1"/>
+      <w:isLgl/>
       <w:numFmt w:val="bullet"/>
-      <w:isLgl/>
       <w:lvlText w:val="§"/>
-      <w:lvlJc w:val="start"/>
-      <w:pPr>
-        <w:tabs>
-          <w:tab w:val="num" w:pos="0"/>
-        </w:tabs>
-        <w:ind w:start="4320" w:hanging="360"/>
+      <w:lvlJc w:val="left"/>
+      <w:pPr>
+        <w:tabs>
+          <w:tab w:val="num" w:pos="0"/>
+        </w:tabs>
+        <w:ind w:left="4320" w:hanging="360"/>
       </w:pPr>
       <w:rPr>
         <w:rFonts w:ascii="Wingdings" w:hAnsi="Wingdings" w:cs="Wingdings" w:hint="default"/>
@@ -3985,15 +3951,15 @@
     </w:lvl>
     <w:lvl w:ilvl="6">
       <w:start w:val="1"/>
+      <w:isLgl/>
       <w:numFmt w:val="bullet"/>
-      <w:isLgl/>
       <w:lvlText w:val="·"/>
-      <w:lvlJc w:val="start"/>
-      <w:pPr>
-        <w:tabs>
-          <w:tab w:val="num" w:pos="0"/>
-        </w:tabs>
-        <w:ind w:start="5040" w:hanging="360"/>
+      <w:lvlJc w:val="left"/>
+      <w:pPr>
+        <w:tabs>
+          <w:tab w:val="num" w:pos="0"/>
+        </w:tabs>
+        <w:ind w:left="5040" w:hanging="360"/>
       </w:pPr>
       <w:rPr>
         <w:rFonts w:ascii="Symbol" w:hAnsi="Symbol" w:cs="Symbol" w:hint="default"/>
@@ -4001,15 +3967,15 @@
     </w:lvl>
     <w:lvl w:ilvl="7">
       <w:start w:val="1"/>
+      <w:isLgl/>
       <w:numFmt w:val="bullet"/>
-      <w:isLgl/>
       <w:lvlText w:val="o"/>
-      <w:lvlJc w:val="start"/>
-      <w:pPr>
-        <w:tabs>
-          <w:tab w:val="num" w:pos="0"/>
-        </w:tabs>
-        <w:ind w:start="5760" w:hanging="360"/>
+      <w:lvlJc w:val="left"/>
+      <w:pPr>
+        <w:tabs>
+          <w:tab w:val="num" w:pos="0"/>
+        </w:tabs>
+        <w:ind w:left="5760" w:hanging="360"/>
       </w:pPr>
       <w:rPr>
         <w:rFonts w:ascii="Courier New" w:hAnsi="Courier New" w:cs="Courier New" w:hint="default"/>
@@ -4017,15 +3983,15 @@
     </w:lvl>
     <w:lvl w:ilvl="8">
       <w:start w:val="1"/>
+      <w:isLgl/>
       <w:numFmt w:val="bullet"/>
-      <w:isLgl/>
       <w:lvlText w:val="§"/>
-      <w:lvlJc w:val="start"/>
-      <w:pPr>
-        <w:tabs>
-          <w:tab w:val="num" w:pos="0"/>
-        </w:tabs>
-        <w:ind w:start="6480" w:hanging="360"/>
+      <w:lvlJc w:val="left"/>
+      <w:pPr>
+        <w:tabs>
+          <w:tab w:val="num" w:pos="0"/>
+        </w:tabs>
+        <w:ind w:left="6480" w:hanging="360"/>
       </w:pPr>
       <w:rPr>
         <w:rFonts w:ascii="Wingdings" w:hAnsi="Wingdings" w:cs="Wingdings" w:hint="default"/>
@@ -4035,127 +4001,127 @@
   <w:abstractNum w:abstractNumId="5">
     <w:lvl w:ilvl="0">
       <w:start w:val="1"/>
+      <w:isLgl/>
       <w:numFmt w:val="decimal"/>
+      <w:lvlText w:val="%1."/>
+      <w:lvlJc w:val="left"/>
+      <w:pPr>
+        <w:tabs>
+          <w:tab w:val="num" w:pos="0"/>
+        </w:tabs>
+        <w:ind w:left="720" w:hanging="360"/>
+      </w:pPr>
+      <w:rPr/>
+    </w:lvl>
+    <w:lvl w:ilvl="1">
+      <w:start w:val="1"/>
       <w:isLgl/>
-      <w:lvlText w:val="%1."/>
-      <w:lvlJc w:val="start"/>
-      <w:pPr>
-        <w:tabs>
-          <w:tab w:val="num" w:pos="0"/>
-        </w:tabs>
-        <w:ind w:start="720" w:hanging="360"/>
+      <w:numFmt w:val="lowerLetter"/>
+      <w:lvlText w:val="%2."/>
+      <w:lvlJc w:val="left"/>
+      <w:pPr>
+        <w:tabs>
+          <w:tab w:val="num" w:pos="0"/>
+        </w:tabs>
+        <w:ind w:left="1440" w:hanging="360"/>
       </w:pPr>
       <w:rPr/>
     </w:lvl>
-    <w:lvl w:ilvl="1">
-      <w:start w:val="1"/>
+    <w:lvl w:ilvl="2">
+      <w:start w:val="1"/>
+      <w:isLgl/>
+      <w:numFmt w:val="lowerRoman"/>
+      <w:lvlText w:val="%3."/>
+      <w:lvlJc w:val="right"/>
+      <w:pPr>
+        <w:tabs>
+          <w:tab w:val="num" w:pos="0"/>
+        </w:tabs>
+        <w:ind w:left="2160" w:hanging="180"/>
+      </w:pPr>
+      <w:rPr/>
+    </w:lvl>
+    <w:lvl w:ilvl="3">
+      <w:start w:val="1"/>
+      <w:isLgl/>
+      <w:numFmt w:val="decimal"/>
+      <w:lvlText w:val="%4."/>
+      <w:lvlJc w:val="left"/>
+      <w:pPr>
+        <w:tabs>
+          <w:tab w:val="num" w:pos="0"/>
+        </w:tabs>
+        <w:ind w:left="2880" w:hanging="360"/>
+      </w:pPr>
+      <w:rPr/>
+    </w:lvl>
+    <w:lvl w:ilvl="4">
+      <w:start w:val="1"/>
+      <w:isLgl/>
       <w:numFmt w:val="lowerLetter"/>
+      <w:lvlText w:val="%5."/>
+      <w:lvlJc w:val="left"/>
+      <w:pPr>
+        <w:tabs>
+          <w:tab w:val="num" w:pos="0"/>
+        </w:tabs>
+        <w:ind w:left="3600" w:hanging="360"/>
+      </w:pPr>
+      <w:rPr/>
+    </w:lvl>
+    <w:lvl w:ilvl="5">
+      <w:start w:val="1"/>
       <w:isLgl/>
-      <w:lvlText w:val="%2."/>
-      <w:lvlJc w:val="start"/>
-      <w:pPr>
-        <w:tabs>
-          <w:tab w:val="num" w:pos="0"/>
-        </w:tabs>
-        <w:ind w:start="1440" w:hanging="360"/>
+      <w:numFmt w:val="lowerRoman"/>
+      <w:lvlText w:val="%6."/>
+      <w:lvlJc w:val="right"/>
+      <w:pPr>
+        <w:tabs>
+          <w:tab w:val="num" w:pos="0"/>
+        </w:tabs>
+        <w:ind w:left="4320" w:hanging="180"/>
       </w:pPr>
       <w:rPr/>
     </w:lvl>
-    <w:lvl w:ilvl="2">
-      <w:start w:val="1"/>
+    <w:lvl w:ilvl="6">
+      <w:start w:val="1"/>
+      <w:isLgl/>
+      <w:numFmt w:val="decimal"/>
+      <w:lvlText w:val="%7."/>
+      <w:lvlJc w:val="left"/>
+      <w:pPr>
+        <w:tabs>
+          <w:tab w:val="num" w:pos="0"/>
+        </w:tabs>
+        <w:ind w:left="5040" w:hanging="360"/>
+      </w:pPr>
+      <w:rPr/>
+    </w:lvl>
+    <w:lvl w:ilvl="7">
+      <w:start w:val="1"/>
+      <w:isLgl/>
+      <w:numFmt w:val="lowerLetter"/>
+      <w:lvlText w:val="%8."/>
+      <w:lvlJc w:val="left"/>
+      <w:pPr>
+        <w:tabs>
+          <w:tab w:val="num" w:pos="0"/>
+        </w:tabs>
+        <w:ind w:left="5760" w:hanging="360"/>
+      </w:pPr>
+      <w:rPr/>
+    </w:lvl>
+    <w:lvl w:ilvl="8">
+      <w:start w:val="1"/>
+      <w:isLgl/>
       <w:numFmt w:val="lowerRoman"/>
-      <w:isLgl/>
-      <w:lvlText w:val="%3."/>
-      <w:lvlJc w:val="end"/>
-      <w:pPr>
-        <w:tabs>
-          <w:tab w:val="num" w:pos="0"/>
-        </w:tabs>
-        <w:ind w:start="2160" w:hanging="180"/>
-      </w:pPr>
-      <w:rPr/>
-    </w:lvl>
-    <w:lvl w:ilvl="3">
-      <w:start w:val="1"/>
-      <w:numFmt w:val="decimal"/>
-      <w:isLgl/>
-      <w:lvlText w:val="%4."/>
-      <w:lvlJc w:val="start"/>
-      <w:pPr>
-        <w:tabs>
-          <w:tab w:val="num" w:pos="0"/>
-        </w:tabs>
-        <w:ind w:start="2880" w:hanging="360"/>
-      </w:pPr>
-      <w:rPr/>
-    </w:lvl>
-    <w:lvl w:ilvl="4">
-      <w:start w:val="1"/>
-      <w:numFmt w:val="lowerLetter"/>
-      <w:isLgl/>
-      <w:lvlText w:val="%5."/>
-      <w:lvlJc w:val="start"/>
-      <w:pPr>
-        <w:tabs>
-          <w:tab w:val="num" w:pos="0"/>
-        </w:tabs>
-        <w:ind w:start="3600" w:hanging="360"/>
-      </w:pPr>
-      <w:rPr/>
-    </w:lvl>
-    <w:lvl w:ilvl="5">
-      <w:start w:val="1"/>
-      <w:numFmt w:val="lowerRoman"/>
-      <w:isLgl/>
-      <w:lvlText w:val="%6."/>
-      <w:lvlJc w:val="end"/>
-      <w:pPr>
-        <w:tabs>
-          <w:tab w:val="num" w:pos="0"/>
-        </w:tabs>
-        <w:ind w:start="4320" w:hanging="180"/>
-      </w:pPr>
-      <w:rPr/>
-    </w:lvl>
-    <w:lvl w:ilvl="6">
-      <w:start w:val="1"/>
-      <w:numFmt w:val="decimal"/>
-      <w:isLgl/>
-      <w:lvlText w:val="%7."/>
-      <w:lvlJc w:val="start"/>
-      <w:pPr>
-        <w:tabs>
-          <w:tab w:val="num" w:pos="0"/>
-        </w:tabs>
-        <w:ind w:start="5040" w:hanging="360"/>
-      </w:pPr>
-      <w:rPr/>
-    </w:lvl>
-    <w:lvl w:ilvl="7">
-      <w:start w:val="1"/>
-      <w:numFmt w:val="lowerLetter"/>
-      <w:isLgl/>
-      <w:lvlText w:val="%8."/>
-      <w:lvlJc w:val="start"/>
-      <w:pPr>
-        <w:tabs>
-          <w:tab w:val="num" w:pos="0"/>
-        </w:tabs>
-        <w:ind w:start="5760" w:hanging="360"/>
-      </w:pPr>
-      <w:rPr/>
-    </w:lvl>
-    <w:lvl w:ilvl="8">
-      <w:start w:val="1"/>
-      <w:numFmt w:val="lowerRoman"/>
-      <w:isLgl/>
       <w:lvlText w:val="%9."/>
-      <w:lvlJc w:val="end"/>
-      <w:pPr>
-        <w:tabs>
-          <w:tab w:val="num" w:pos="0"/>
-        </w:tabs>
-        <w:ind w:start="6480" w:hanging="180"/>
+      <w:lvlJc w:val="right"/>
+      <w:pPr>
+        <w:tabs>
+          <w:tab w:val="num" w:pos="0"/>
+        </w:tabs>
+        <w:ind w:left="6480" w:hanging="180"/>
       </w:pPr>
       <w:rPr/>
     </w:lvl>
@@ -4163,127 +4129,127 @@
   <w:abstractNum w:abstractNumId="6">
     <w:lvl w:ilvl="0">
       <w:start w:val="1"/>
+      <w:isLgl/>
       <w:numFmt w:val="decimal"/>
+      <w:lvlText w:val="%1."/>
+      <w:lvlJc w:val="left"/>
+      <w:pPr>
+        <w:tabs>
+          <w:tab w:val="num" w:pos="0"/>
+        </w:tabs>
+        <w:ind w:left="720" w:hanging="360"/>
+      </w:pPr>
+      <w:rPr/>
+    </w:lvl>
+    <w:lvl w:ilvl="1">
+      <w:start w:val="1"/>
       <w:isLgl/>
-      <w:lvlText w:val="%1."/>
-      <w:lvlJc w:val="start"/>
-      <w:pPr>
-        <w:tabs>
-          <w:tab w:val="num" w:pos="0"/>
-        </w:tabs>
-        <w:ind w:start="720" w:hanging="360"/>
+      <w:numFmt w:val="lowerLetter"/>
+      <w:lvlText w:val="%2."/>
+      <w:lvlJc w:val="left"/>
+      <w:pPr>
+        <w:tabs>
+          <w:tab w:val="num" w:pos="0"/>
+        </w:tabs>
+        <w:ind w:left="1440" w:hanging="360"/>
       </w:pPr>
       <w:rPr/>
     </w:lvl>
-    <w:lvl w:ilvl="1">
-      <w:start w:val="1"/>
+    <w:lvl w:ilvl="2">
+      <w:start w:val="1"/>
+      <w:isLgl/>
+      <w:numFmt w:val="lowerRoman"/>
+      <w:lvlText w:val="%3."/>
+      <w:lvlJc w:val="right"/>
+      <w:pPr>
+        <w:tabs>
+          <w:tab w:val="num" w:pos="0"/>
+        </w:tabs>
+        <w:ind w:left="2160" w:hanging="180"/>
+      </w:pPr>
+      <w:rPr/>
+    </w:lvl>
+    <w:lvl w:ilvl="3">
+      <w:start w:val="1"/>
+      <w:isLgl/>
+      <w:numFmt w:val="decimal"/>
+      <w:lvlText w:val="%4."/>
+      <w:lvlJc w:val="left"/>
+      <w:pPr>
+        <w:tabs>
+          <w:tab w:val="num" w:pos="0"/>
+        </w:tabs>
+        <w:ind w:left="2880" w:hanging="360"/>
+      </w:pPr>
+      <w:rPr/>
+    </w:lvl>
+    <w:lvl w:ilvl="4">
+      <w:start w:val="1"/>
+      <w:isLgl/>
       <w:numFmt w:val="lowerLetter"/>
+      <w:lvlText w:val="%5."/>
+      <w:lvlJc w:val="left"/>
+      <w:pPr>
+        <w:tabs>
+          <w:tab w:val="num" w:pos="0"/>
+        </w:tabs>
+        <w:ind w:left="3600" w:hanging="360"/>
+      </w:pPr>
+      <w:rPr/>
+    </w:lvl>
+    <w:lvl w:ilvl="5">
+      <w:start w:val="1"/>
       <w:isLgl/>
-      <w:lvlText w:val="%2."/>
-      <w:lvlJc w:val="start"/>
-      <w:pPr>
-        <w:tabs>
-          <w:tab w:val="num" w:pos="0"/>
-        </w:tabs>
-        <w:ind w:start="1440" w:hanging="360"/>
+      <w:numFmt w:val="lowerRoman"/>
+      <w:lvlText w:val="%6."/>
+      <w:lvlJc w:val="right"/>
+      <w:pPr>
+        <w:tabs>
+          <w:tab w:val="num" w:pos="0"/>
+        </w:tabs>
+        <w:ind w:left="4320" w:hanging="180"/>
       </w:pPr>
       <w:rPr/>
     </w:lvl>
-    <w:lvl w:ilvl="2">
-      <w:start w:val="1"/>
+    <w:lvl w:ilvl="6">
+      <w:start w:val="1"/>
+      <w:isLgl/>
+      <w:numFmt w:val="decimal"/>
+      <w:lvlText w:val="%7."/>
+      <w:lvlJc w:val="left"/>
+      <w:pPr>
+        <w:tabs>
+          <w:tab w:val="num" w:pos="0"/>
+        </w:tabs>
+        <w:ind w:left="5040" w:hanging="360"/>
+      </w:pPr>
+      <w:rPr/>
+    </w:lvl>
+    <w:lvl w:ilvl="7">
+      <w:start w:val="1"/>
+      <w:isLgl/>
+      <w:numFmt w:val="lowerLetter"/>
+      <w:lvlText w:val="%8."/>
+      <w:lvlJc w:val="left"/>
+      <w:pPr>
+        <w:tabs>
+          <w:tab w:val="num" w:pos="0"/>
+        </w:tabs>
+        <w:ind w:left="5760" w:hanging="360"/>
+      </w:pPr>
+      <w:rPr/>
+    </w:lvl>
+    <w:lvl w:ilvl="8">
+      <w:start w:val="1"/>
+      <w:isLgl/>
       <w:numFmt w:val="lowerRoman"/>
-      <w:isLgl/>
-      <w:lvlText w:val="%3."/>
-      <w:lvlJc w:val="end"/>
-      <w:pPr>
-        <w:tabs>
-          <w:tab w:val="num" w:pos="0"/>
-        </w:tabs>
-        <w:ind w:start="2160" w:hanging="180"/>
-      </w:pPr>
-      <w:rPr/>
-    </w:lvl>
-    <w:lvl w:ilvl="3">
-      <w:start w:val="1"/>
-      <w:numFmt w:val="decimal"/>
-      <w:isLgl/>
-      <w:lvlText w:val="%4."/>
-      <w:lvlJc w:val="start"/>
-      <w:pPr>
-        <w:tabs>
-          <w:tab w:val="num" w:pos="0"/>
-        </w:tabs>
-        <w:ind w:start="2880" w:hanging="360"/>
-      </w:pPr>
-      <w:rPr/>
-    </w:lvl>
-    <w:lvl w:ilvl="4">
-      <w:start w:val="1"/>
-      <w:numFmt w:val="lowerLetter"/>
-      <w:isLgl/>
-      <w:lvlText w:val="%5."/>
-      <w:lvlJc w:val="start"/>
-      <w:pPr>
-        <w:tabs>
-          <w:tab w:val="num" w:pos="0"/>
-        </w:tabs>
-        <w:ind w:start="3600" w:hanging="360"/>
-      </w:pPr>
-      <w:rPr/>
-    </w:lvl>
-    <w:lvl w:ilvl="5">
-      <w:start w:val="1"/>
-      <w:numFmt w:val="lowerRoman"/>
-      <w:isLgl/>
-      <w:lvlText w:val="%6."/>
-      <w:lvlJc w:val="end"/>
-      <w:pPr>
-        <w:tabs>
-          <w:tab w:val="num" w:pos="0"/>
-        </w:tabs>
-        <w:ind w:start="4320" w:hanging="180"/>
-      </w:pPr>
-      <w:rPr/>
-    </w:lvl>
-    <w:lvl w:ilvl="6">
-      <w:start w:val="1"/>
-      <w:numFmt w:val="decimal"/>
-      <w:isLgl/>
-      <w:lvlText w:val="%7."/>
-      <w:lvlJc w:val="start"/>
-      <w:pPr>
-        <w:tabs>
-          <w:tab w:val="num" w:pos="0"/>
-        </w:tabs>
-        <w:ind w:start="5040" w:hanging="360"/>
-      </w:pPr>
-      <w:rPr/>
-    </w:lvl>
-    <w:lvl w:ilvl="7">
-      <w:start w:val="1"/>
-      <w:numFmt w:val="lowerLetter"/>
-      <w:isLgl/>
-      <w:lvlText w:val="%8."/>
-      <w:lvlJc w:val="start"/>
-      <w:pPr>
-        <w:tabs>
-          <w:tab w:val="num" w:pos="0"/>
-        </w:tabs>
-        <w:ind w:start="5760" w:hanging="360"/>
-      </w:pPr>
-      <w:rPr/>
-    </w:lvl>
-    <w:lvl w:ilvl="8">
-      <w:start w:val="1"/>
-      <w:numFmt w:val="lowerRoman"/>
-      <w:isLgl/>
       <w:lvlText w:val="%9."/>
-      <w:lvlJc w:val="end"/>
-      <w:pPr>
-        <w:tabs>
-          <w:tab w:val="num" w:pos="0"/>
-        </w:tabs>
-        <w:ind w:start="6480" w:hanging="180"/>
+      <w:lvlJc w:val="right"/>
+      <w:pPr>
+        <w:tabs>
+          <w:tab w:val="num" w:pos="0"/>
+        </w:tabs>
+        <w:ind w:left="6480" w:hanging="180"/>
       </w:pPr>
       <w:rPr/>
     </w:lvl>
@@ -4294,12 +4260,12 @@
       <w:numFmt w:val="none"/>
       <w:suff w:val="nothing"/>
       <w:lvlText w:val=""/>
-      <w:lvlJc w:val="start"/>
-      <w:pPr>
-        <w:tabs>
-          <w:tab w:val="num" w:pos="0"/>
-        </w:tabs>
-        <w:ind w:start="0" w:hanging="0"/>
+      <w:lvlJc w:val="left"/>
+      <w:pPr>
+        <w:tabs>
+          <w:tab w:val="num" w:pos="0"/>
+        </w:tabs>
+        <w:ind w:left="0" w:hanging="0"/>
       </w:pPr>
     </w:lvl>
     <w:lvl w:ilvl="1">
@@ -4307,12 +4273,12 @@
       <w:numFmt w:val="none"/>
       <w:suff w:val="nothing"/>
       <w:lvlText w:val=""/>
-      <w:lvlJc w:val="start"/>
-      <w:pPr>
-        <w:tabs>
-          <w:tab w:val="num" w:pos="0"/>
-        </w:tabs>
-        <w:ind w:start="0" w:hanging="0"/>
+      <w:lvlJc w:val="left"/>
+      <w:pPr>
+        <w:tabs>
+          <w:tab w:val="num" w:pos="0"/>
+        </w:tabs>
+        <w:ind w:left="0" w:hanging="0"/>
       </w:pPr>
     </w:lvl>
     <w:lvl w:ilvl="2">
@@ -4320,12 +4286,12 @@
       <w:numFmt w:val="none"/>
       <w:suff w:val="nothing"/>
       <w:lvlText w:val=""/>
-      <w:lvlJc w:val="start"/>
-      <w:pPr>
-        <w:tabs>
-          <w:tab w:val="num" w:pos="0"/>
-        </w:tabs>
-        <w:ind w:start="0" w:hanging="0"/>
+      <w:lvlJc w:val="left"/>
+      <w:pPr>
+        <w:tabs>
+          <w:tab w:val="num" w:pos="0"/>
+        </w:tabs>
+        <w:ind w:left="0" w:hanging="0"/>
       </w:pPr>
     </w:lvl>
     <w:lvl w:ilvl="3">
@@ -4333,12 +4299,12 @@
       <w:numFmt w:val="none"/>
       <w:suff w:val="nothing"/>
       <w:lvlText w:val=""/>
-      <w:lvlJc w:val="start"/>
-      <w:pPr>
-        <w:tabs>
-          <w:tab w:val="num" w:pos="0"/>
-        </w:tabs>
-        <w:ind w:start="0" w:hanging="0"/>
+      <w:lvlJc w:val="left"/>
+      <w:pPr>
+        <w:tabs>
+          <w:tab w:val="num" w:pos="0"/>
+        </w:tabs>
+        <w:ind w:left="0" w:hanging="0"/>
       </w:pPr>
     </w:lvl>
     <w:lvl w:ilvl="4">
@@ -4346,12 +4312,12 @@
       <w:numFmt w:val="none"/>
       <w:suff w:val="nothing"/>
       <w:lvlText w:val=""/>
-      <w:lvlJc w:val="start"/>
-      <w:pPr>
-        <w:tabs>
-          <w:tab w:val="num" w:pos="0"/>
-        </w:tabs>
-        <w:ind w:start="0" w:hanging="0"/>
+      <w:lvlJc w:val="left"/>
+      <w:pPr>
+        <w:tabs>
+          <w:tab w:val="num" w:pos="0"/>
+        </w:tabs>
+        <w:ind w:left="0" w:hanging="0"/>
       </w:pPr>
     </w:lvl>
     <w:lvl w:ilvl="5">
@@ -4359,12 +4325,12 @@
       <w:numFmt w:val="none"/>
       <w:suff w:val="nothing"/>
       <w:lvlText w:val=""/>
-      <w:lvlJc w:val="start"/>
-      <w:pPr>
-        <w:tabs>
-          <w:tab w:val="num" w:pos="0"/>
-        </w:tabs>
-        <w:ind w:start="0" w:hanging="0"/>
+      <w:lvlJc w:val="left"/>
+      <w:pPr>
+        <w:tabs>
+          <w:tab w:val="num" w:pos="0"/>
+        </w:tabs>
+        <w:ind w:left="0" w:hanging="0"/>
       </w:pPr>
     </w:lvl>
     <w:lvl w:ilvl="6">
@@ -4372,12 +4338,12 @@
       <w:numFmt w:val="none"/>
       <w:suff w:val="nothing"/>
       <w:lvlText w:val=""/>
-      <w:lvlJc w:val="start"/>
-      <w:pPr>
-        <w:tabs>
-          <w:tab w:val="num" w:pos="0"/>
-        </w:tabs>
-        <w:ind w:start="0" w:hanging="0"/>
+      <w:lvlJc w:val="left"/>
+      <w:pPr>
+        <w:tabs>
+          <w:tab w:val="num" w:pos="0"/>
+        </w:tabs>
+        <w:ind w:left="0" w:hanging="0"/>
       </w:pPr>
     </w:lvl>
     <w:lvl w:ilvl="7">
@@ -4385,12 +4351,12 @@
       <w:numFmt w:val="none"/>
       <w:suff w:val="nothing"/>
       <w:lvlText w:val=""/>
-      <w:lvlJc w:val="start"/>
-      <w:pPr>
-        <w:tabs>
-          <w:tab w:val="num" w:pos="0"/>
-        </w:tabs>
-        <w:ind w:start="0" w:hanging="0"/>
+      <w:lvlJc w:val="left"/>
+      <w:pPr>
+        <w:tabs>
+          <w:tab w:val="num" w:pos="0"/>
+        </w:tabs>
+        <w:ind w:left="0" w:hanging="0"/>
       </w:pPr>
     </w:lvl>
     <w:lvl w:ilvl="8">
@@ -4398,12 +4364,12 @@
       <w:numFmt w:val="none"/>
       <w:suff w:val="nothing"/>
       <w:lvlText w:val=""/>
-      <w:lvlJc w:val="start"/>
-      <w:pPr>
-        <w:tabs>
-          <w:tab w:val="num" w:pos="0"/>
-        </w:tabs>
-        <w:ind w:start="0" w:hanging="0"/>
+      <w:lvlJc w:val="left"/>
+      <w:pPr>
+        <w:tabs>
+          <w:tab w:val="num" w:pos="0"/>
+        </w:tabs>
+        <w:ind w:left="0" w:hanging="0"/>
       </w:pPr>
     </w:lvl>
   </w:abstractNum>
@@ -4840,7 +4806,7 @@
       <w:suppressAutoHyphens w:val="true"/>
       <w:bidi w:val="0"/>
       <w:spacing w:before="0" w:after="0"/>
-      <w:jc w:val="start"/>
+      <w:jc w:val="left"/>
     </w:pPr>
     <w:rPr>
       <w:rFonts w:ascii="Calibri" w:hAnsi="Calibri" w:eastAsia="Arial" w:cs="Arial" w:asciiTheme="minorHAnsi" w:cstheme="minorBidi" w:eastAsiaTheme="minorEastAsia" w:hAnsiTheme="minorHAnsi"/>
@@ -4852,7 +4818,7 @@
     </w:rPr>
   </w:style>
   <w:style w:type="paragraph" w:styleId="Heading1">
-    <w:name w:val="heading 1"/>
+    <w:name w:val="Heading 1"/>
     <w:basedOn w:val="Normal"/>
     <w:uiPriority w:val="9"/>
     <w:qFormat/>
@@ -4869,7 +4835,7 @@
     </w:rPr>
   </w:style>
   <w:style w:type="paragraph" w:styleId="Heading2">
-    <w:name w:val="heading 2"/>
+    <w:name w:val="Heading 2"/>
     <w:basedOn w:val="Normal"/>
     <w:uiPriority w:val="9"/>
     <w:unhideWhenUsed/>
@@ -4892,7 +4858,7 @@
     </w:rPr>
   </w:style>
   <w:style w:type="paragraph" w:styleId="Heading3">
-    <w:name w:val="heading 3"/>
+    <w:name w:val="Heading 3"/>
     <w:basedOn w:val="Normal"/>
     <w:uiPriority w:val="9"/>
     <w:unhideWhenUsed/>
@@ -4913,7 +4879,7 @@
     </w:rPr>
   </w:style>
   <w:style w:type="paragraph" w:styleId="Heading4">
-    <w:name w:val="heading 4"/>
+    <w:name w:val="Heading 4"/>
     <w:basedOn w:val="Normal"/>
     <w:uiPriority w:val="9"/>
     <w:unhideWhenUsed/>
@@ -4933,7 +4899,7 @@
     </w:rPr>
   </w:style>
   <w:style w:type="paragraph" w:styleId="Heading5">
-    <w:name w:val="heading 5"/>
+    <w:name w:val="Heading 5"/>
     <w:basedOn w:val="Normal"/>
     <w:uiPriority w:val="9"/>
     <w:unhideWhenUsed/>
@@ -4951,7 +4917,7 @@
     </w:rPr>
   </w:style>
   <w:style w:type="paragraph" w:styleId="Heading6">
-    <w:name w:val="heading 6"/>
+    <w:name w:val="Heading 6"/>
     <w:basedOn w:val="Normal"/>
     <w:uiPriority w:val="9"/>
     <w:unhideWhenUsed/>
@@ -4971,7 +4937,7 @@
     </w:rPr>
   </w:style>
   <w:style w:type="paragraph" w:styleId="Heading7">
-    <w:name w:val="heading 7"/>
+    <w:name w:val="Heading 7"/>
     <w:basedOn w:val="Normal"/>
     <w:uiPriority w:val="9"/>
     <w:unhideWhenUsed/>
@@ -4993,7 +4959,7 @@
     </w:rPr>
   </w:style>
   <w:style w:type="paragraph" w:styleId="Heading8">
-    <w:name w:val="heading 8"/>
+    <w:name w:val="Heading 8"/>
     <w:basedOn w:val="Normal"/>
     <w:uiPriority w:val="9"/>
     <w:unhideWhenUsed/>
@@ -5013,7 +4979,7 @@
     </w:rPr>
   </w:style>
   <w:style w:type="paragraph" w:styleId="Heading9">
-    <w:name w:val="heading 9"/>
+    <w:name w:val="Heading 9"/>
     <w:basedOn w:val="Normal"/>
     <w:uiPriority w:val="9"/>
     <w:unhideWhenUsed/>
@@ -5223,8 +5189,8 @@
       <w:sz w:val="18"/>
     </w:rPr>
   </w:style>
-  <w:style w:type="character" w:styleId="FootnoteCharactersuser" w:customStyle="1">
-    <w:name w:val="Footnote Characters (user)"/>
+  <w:style w:type="character" w:styleId="FootnoteCharacters">
+    <w:name w:val="Footnote Characters"/>
     <w:qFormat/>
     <w:rPr>
       <w:vertAlign w:val="superscript"/>
@@ -5237,15 +5203,8 @@
       <w:vertAlign w:val="superscript"/>
     </w:rPr>
   </w:style>
-  <w:style w:type="character" w:styleId="FootnoteCharacters">
-    <w:name w:val="Footnote Characters"/>
-    <w:qFormat/>
-    <w:rPr>
-      <w:vertAlign w:val="superscript"/>
-    </w:rPr>
-  </w:style>
   <w:style w:type="character" w:styleId="FootnoteReference">
-    <w:name w:val="footnote reference"/>
+    <w:name w:val="Footnote Reference"/>
     <w:rPr>
       <w:vertAlign w:val="superscript"/>
     </w:rPr>
@@ -5258,8 +5217,8 @@
       <w:sz w:val="20"/>
     </w:rPr>
   </w:style>
-  <w:style w:type="character" w:styleId="EndnoteCharactersuser" w:customStyle="1">
-    <w:name w:val="Endnote Characters (user)"/>
+  <w:style w:type="character" w:styleId="EndnoteCharacters">
+    <w:name w:val="Endnote Characters"/>
     <w:qFormat/>
     <w:rPr>
       <w:vertAlign w:val="superscript"/>
@@ -5272,15 +5231,8 @@
       <w:vertAlign w:val="superscript"/>
     </w:rPr>
   </w:style>
-  <w:style w:type="character" w:styleId="EndnoteCharacters">
-    <w:name w:val="Endnote Characters"/>
-    <w:qFormat/>
-    <w:rPr>
-      <w:vertAlign w:val="superscript"/>
-    </w:rPr>
-  </w:style>
   <w:style w:type="character" w:styleId="EndnoteReference">
-    <w:name w:val="endnote reference"/>
+    <w:name w:val="Endnote Reference"/>
     <w:rPr>
       <w:vertAlign w:val="superscript"/>
     </w:rPr>
@@ -5305,8 +5257,8 @@
       <w:szCs w:val="18"/>
     </w:rPr>
   </w:style>
-  <w:style w:type="paragraph" w:styleId="Heading">
-    <w:name w:val="Heading"/>
+  <w:style w:type="paragraph" w:styleId="Ttulo" w:customStyle="1">
+    <w:name w:val="Título"/>
     <w:basedOn w:val="Normal"/>
     <w:next w:val="BodyText"/>
     <w:qFormat/>
@@ -5337,7 +5289,7 @@
     </w:rPr>
   </w:style>
   <w:style w:type="paragraph" w:styleId="Caption">
-    <w:name w:val="caption"/>
+    <w:name w:val="Caption"/>
     <w:basedOn w:val="Normal"/>
     <w:uiPriority w:val="35"/>
     <w:semiHidden/>
@@ -5352,32 +5304,6 @@
       <w:color w:themeColor="accent1" w:val="5B9BD5"/>
       <w:sz w:val="18"/>
       <w:szCs w:val="18"/>
-    </w:rPr>
-  </w:style>
-  <w:style w:type="paragraph" w:styleId="Index">
-    <w:name w:val="Index"/>
-    <w:basedOn w:val="Normal"/>
-    <w:qFormat/>
-    <w:pPr>
-      <w:suppressLineNumbers/>
-    </w:pPr>
-    <w:rPr>
-      <w:rFonts w:ascii="Calibri" w:hAnsi="Calibri" w:cs="Noto Sans Devanagari"/>
-    </w:rPr>
-  </w:style>
-  <w:style w:type="paragraph" w:styleId="Ttulo" w:customStyle="1">
-    <w:name w:val="Título"/>
-    <w:basedOn w:val="Normal"/>
-    <w:next w:val="BodyText"/>
-    <w:qFormat/>
-    <w:pPr>
-      <w:keepNext w:val="true"/>
-      <w:spacing w:before="240" w:after="120"/>
-    </w:pPr>
-    <w:rPr>
-      <w:rFonts w:ascii="Liberation Sans" w:hAnsi="Liberation Sans" w:eastAsia="Noto Sans CJK SC" w:cs="Noto Sans Devanagari"/>
-      <w:sz w:val="28"/>
-      <w:szCs w:val="28"/>
     </w:rPr>
   </w:style>
   <w:style w:type="paragraph" w:styleId="ndice" w:customStyle="1">
@@ -5418,7 +5344,7 @@
       <w:suppressAutoHyphens w:val="true"/>
       <w:bidi w:val="0"/>
       <w:spacing w:before="0" w:after="0"/>
-      <w:jc w:val="start"/>
+      <w:jc w:val="left"/>
     </w:pPr>
     <w:rPr>
       <w:rFonts w:ascii="Calibri" w:hAnsi="Calibri" w:eastAsia="Arial" w:cs="Arial" w:asciiTheme="minorHAnsi" w:cstheme="minorBidi" w:eastAsiaTheme="minorEastAsia" w:hAnsiTheme="minorHAnsi"/>
@@ -5459,7 +5385,7 @@
     <w:uiPriority w:val="29"/>
     <w:qFormat/>
     <w:pPr>
-      <w:ind w:start="720" w:end="720"/>
+      <w:ind w:left="720" w:right="720"/>
     </w:pPr>
     <w:rPr>
       <w:i/>
@@ -5478,14 +5404,14 @@
         <w:right w:val="single" w:sz="4" w:space="10" w:color="FFFFFF"/>
       </w:pBdr>
       <w:shd w:val="clear" w:color="auto" w:fill="F2F2F2"/>
-      <w:ind w:start="720" w:end="720"/>
+      <w:ind w:left="720" w:right="720"/>
     </w:pPr>
     <w:rPr>
       <w:i/>
     </w:rPr>
   </w:style>
   <w:style w:type="paragraph" w:styleId="FootnoteText">
-    <w:name w:val="footnote text"/>
+    <w:name w:val="Footnote Text"/>
     <w:basedOn w:val="Normal"/>
     <w:uiPriority w:val="99"/>
     <w:semiHidden/>
@@ -5498,7 +5424,7 @@
     </w:rPr>
   </w:style>
   <w:style w:type="paragraph" w:styleId="EndnoteText">
-    <w:name w:val="endnote text"/>
+    <w:name w:val="Endnote Text"/>
     <w:basedOn w:val="Normal"/>
     <w:uiPriority w:val="99"/>
     <w:semiHidden/>
@@ -5509,7 +5435,7 @@
     </w:rPr>
   </w:style>
   <w:style w:type="paragraph" w:styleId="TOC1">
-    <w:name w:val="toc 1"/>
+    <w:name w:val="TOC 1"/>
     <w:basedOn w:val="Normal"/>
     <w:uiPriority w:val="39"/>
     <w:unhideWhenUsed/>
@@ -5519,95 +5445,95 @@
     <w:rPr/>
   </w:style>
   <w:style w:type="paragraph" w:styleId="TOC2">
-    <w:name w:val="toc 2"/>
+    <w:name w:val="TOC 2"/>
     <w:basedOn w:val="Normal"/>
     <w:uiPriority w:val="39"/>
     <w:unhideWhenUsed/>
     <w:pPr>
       <w:spacing w:before="0" w:after="57"/>
-      <w:ind w:start="283"/>
+      <w:ind w:left="283"/>
     </w:pPr>
     <w:rPr/>
   </w:style>
   <w:style w:type="paragraph" w:styleId="TOC3">
-    <w:name w:val="toc 3"/>
+    <w:name w:val="TOC 3"/>
     <w:basedOn w:val="Normal"/>
     <w:uiPriority w:val="39"/>
     <w:unhideWhenUsed/>
     <w:pPr>
       <w:spacing w:before="0" w:after="57"/>
-      <w:ind w:start="567"/>
+      <w:ind w:left="567"/>
     </w:pPr>
     <w:rPr/>
   </w:style>
   <w:style w:type="paragraph" w:styleId="TOC4">
-    <w:name w:val="toc 4"/>
+    <w:name w:val="TOC 4"/>
     <w:basedOn w:val="Normal"/>
     <w:uiPriority w:val="39"/>
     <w:unhideWhenUsed/>
     <w:pPr>
       <w:spacing w:before="0" w:after="57"/>
-      <w:ind w:start="850"/>
+      <w:ind w:left="850"/>
     </w:pPr>
     <w:rPr/>
   </w:style>
   <w:style w:type="paragraph" w:styleId="TOC5">
-    <w:name w:val="toc 5"/>
+    <w:name w:val="TOC 5"/>
     <w:basedOn w:val="Normal"/>
     <w:uiPriority w:val="39"/>
     <w:unhideWhenUsed/>
     <w:pPr>
       <w:spacing w:before="0" w:after="57"/>
-      <w:ind w:start="1134"/>
+      <w:ind w:left="1134"/>
     </w:pPr>
     <w:rPr/>
   </w:style>
   <w:style w:type="paragraph" w:styleId="TOC6">
-    <w:name w:val="toc 6"/>
+    <w:name w:val="TOC 6"/>
     <w:basedOn w:val="Normal"/>
     <w:uiPriority w:val="39"/>
     <w:unhideWhenUsed/>
     <w:pPr>
       <w:spacing w:before="0" w:after="57"/>
-      <w:ind w:start="1417"/>
+      <w:ind w:left="1417"/>
     </w:pPr>
     <w:rPr/>
   </w:style>
   <w:style w:type="paragraph" w:styleId="TOC7">
-    <w:name w:val="toc 7"/>
+    <w:name w:val="TOC 7"/>
     <w:basedOn w:val="Normal"/>
     <w:uiPriority w:val="39"/>
     <w:unhideWhenUsed/>
     <w:pPr>
       <w:spacing w:before="0" w:after="57"/>
-      <w:ind w:start="1701"/>
+      <w:ind w:left="1701"/>
     </w:pPr>
     <w:rPr/>
   </w:style>
   <w:style w:type="paragraph" w:styleId="TOC8">
-    <w:name w:val="toc 8"/>
+    <w:name w:val="TOC 8"/>
     <w:basedOn w:val="Normal"/>
     <w:uiPriority w:val="39"/>
     <w:unhideWhenUsed/>
     <w:pPr>
       <w:spacing w:before="0" w:after="57"/>
-      <w:ind w:start="1984"/>
+      <w:ind w:left="1984"/>
     </w:pPr>
     <w:rPr/>
   </w:style>
   <w:style w:type="paragraph" w:styleId="TOC9">
-    <w:name w:val="toc 9"/>
+    <w:name w:val="TOC 9"/>
     <w:basedOn w:val="Normal"/>
     <w:uiPriority w:val="39"/>
     <w:unhideWhenUsed/>
     <w:pPr>
       <w:spacing w:before="0" w:after="57"/>
-      <w:ind w:start="2268"/>
+      <w:ind w:left="2268"/>
     </w:pPr>
     <w:rPr/>
   </w:style>
   <w:style w:type="paragraph" w:styleId="IndexHeading">
-    <w:name w:val="index heading"/>
+    <w:name w:val="Index Heading"/>
     <w:basedOn w:val="Ttulo"/>
     <w:pPr/>
     <w:rPr/>
@@ -5622,7 +5548,7 @@
       <w:suppressAutoHyphens w:val="true"/>
       <w:bidi w:val="0"/>
       <w:spacing w:before="0" w:after="0"/>
-      <w:jc w:val="start"/>
+      <w:jc w:val="left"/>
     </w:pPr>
     <w:rPr>
       <w:rFonts w:ascii="Calibri" w:hAnsi="Calibri" w:eastAsia="Arial" w:cs="Arial" w:asciiTheme="minorHAnsi" w:cstheme="minorBidi" w:eastAsiaTheme="minorEastAsia" w:hAnsiTheme="minorHAnsi"/>
@@ -5634,29 +5560,22 @@
     </w:rPr>
   </w:style>
   <w:style w:type="paragraph" w:styleId="TableofFigures">
-    <w:name w:val="table of figures"/>
+    <w:name w:val="Table of Figures"/>
     <w:basedOn w:val="Normal"/>
     <w:uiPriority w:val="99"/>
     <w:unhideWhenUsed/>
     <w:pPr/>
     <w:rPr/>
   </w:style>
-  <w:style w:type="paragraph" w:styleId="Cabeceraypie" w:customStyle="1">
+  <w:style w:type="paragraph" w:styleId="Cabeceraypie">
     <w:name w:val="Cabecera y pie"/>
     <w:basedOn w:val="Normal"/>
     <w:qFormat/>
     <w:pPr/>
     <w:rPr/>
   </w:style>
-  <w:style w:type="paragraph" w:styleId="HeaderandFooter">
-    <w:name w:val="Header and Footer"/>
-    <w:basedOn w:val="Normal"/>
-    <w:qFormat/>
-    <w:pPr/>
-    <w:rPr/>
-  </w:style>
   <w:style w:type="paragraph" w:styleId="Header">
-    <w:name w:val="header"/>
+    <w:name w:val="Header"/>
     <w:basedOn w:val="Normal"/>
     <w:uiPriority w:val="99"/>
     <w:unhideWhenUsed/>
@@ -5677,7 +5596,7 @@
     </w:rPr>
   </w:style>
   <w:style w:type="paragraph" w:styleId="Footer">
-    <w:name w:val="footer"/>
+    <w:name w:val="Footer"/>
     <w:basedOn w:val="Normal"/>
     <w:uiPriority w:val="99"/>
     <w:unhideWhenUsed/>
@@ -5693,13 +5612,6 @@
       <w:szCs w:val="18"/>
     </w:rPr>
   </w:style>
-  <w:style w:type="numbering" w:styleId="NoList" w:default="1">
-    <w:name w:val="No List"/>
-    <w:uiPriority w:val="99"/>
-    <w:semiHidden/>
-    <w:unhideWhenUsed/>
-    <w:qFormat/>
-  </w:style>
   <w:style w:type="numbering" w:styleId="Ningunalista" w:customStyle="1">
     <w:name w:val="Ninguna lista"/>
     <w:uiPriority w:val="99"/>
@@ -5732,37 +5644,37 @@
         <a:srgbClr val="000000"/>
       </a:dk1>
       <a:lt1>
-        <a:srgbClr val="FFFFFF"/>
+        <a:srgbClr val="ffffff"/>
       </a:lt1>
       <a:dk2>
-        <a:srgbClr val="44546A"/>
+        <a:srgbClr val="44546a"/>
       </a:dk2>
       <a:lt2>
-        <a:srgbClr val="E7E6E6"/>
+        <a:srgbClr val="e7e6e6"/>
       </a:lt2>
       <a:accent1>
-        <a:srgbClr val="5B9BD5"/>
+        <a:srgbClr val="5b9bd5"/>
       </a:accent1>
       <a:accent2>
-        <a:srgbClr val="ED7D31"/>
+        <a:srgbClr val="ed7d31"/>
       </a:accent2>
       <a:accent3>
-        <a:srgbClr val="A5A5A5"/>
+        <a:srgbClr val="a5a5a5"/>
       </a:accent3>
       <a:accent4>
-        <a:srgbClr val="FFC000"/>
+        <a:srgbClr val="ffc000"/>
       </a:accent4>
       <a:accent5>
-        <a:srgbClr val="4472C4"/>
+        <a:srgbClr val="4472c4"/>
       </a:accent5>
       <a:accent6>
-        <a:srgbClr val="70AD47"/>
+        <a:srgbClr val="70ad47"/>
       </a:accent6>
       <a:hlink>
-        <a:srgbClr val="0563C1"/>
+        <a:srgbClr val="0563c1"/>
       </a:hlink>
       <a:folHlink>
-        <a:srgbClr val="954F72"/>
+        <a:srgbClr val="954f72"/>
       </a:folHlink>
     </a:clrScheme>
     <a:fontScheme name="Office">

</xml_diff>